<commit_message>
Replace lecturer profiles with photo and resume form layouts
</commit_message>
<xml_diff>
--- a/public/dontstop-lecture/profile-friendly.docx
+++ b/public/dontstop-lecture/profile-friendly.docx
@@ -4,99 +4,898 @@
   <w:body>
     <w:p>
       <w:pPr>
-        <w:pStyle w:val="Subtitle"/>
+        <w:jc w:val="center"/>
       </w:pPr>
       <w:r>
-        <w:t>DON’T STOP ENGLISH</w:t>
+        <w:rPr>
+          <w:b/>
+          <w:sz w:val="44"/>
+        </w:rPr>
+        <w:t>강사 이력 요약서</w:t>
       </w:r>
     </w:p>
     <w:p>
       <w:pPr>
-        <w:pStyle w:val="Title"/>
+        <w:jc w:val="center"/>
       </w:pPr>
       <w:r>
-        <w:t>박새미와 함께 말해보는 영어</w:t>
+        <w:t>기관 검토용 · 1쪽 요약 양식</w:t>
       </w:r>
     </w:p>
+    <w:tbl>
+      <w:tblPr>
+        <w:tblStyle w:val="TableGrid"/>
+        <w:tblW w:type="auto" w:w="0"/>
+        <w:tblLayout w:type="fixed"/>
+        <w:tblLook w:firstColumn="1" w:firstRow="1" w:lastColumn="0" w:lastRow="0" w:noHBand="0" w:noVBand="1" w:val="04A0"/>
+      </w:tblPr>
+      <w:tblGrid>
+        <w:gridCol w:w="1417"/>
+        <w:gridCol w:w="6860"/>
+        <w:gridCol w:w="1701"/>
+      </w:tblGrid>
+      <w:tr>
+        <w:trPr>
+          <w:trHeight w:val="454"/>
+        </w:trPr>
+        <w:tc>
+          <w:tcPr>
+            <w:tcW w:type="dxa" w:w="1417"/>
+            <w:shd w:fill="F0F3F6"/>
+          </w:tcPr>
+          <w:p>
+            <w:r>
+              <w:t>성명</w:t>
+            </w:r>
+          </w:p>
+        </w:tc>
+        <w:tc>
+          <w:tcPr>
+            <w:tcW w:type="dxa" w:w="5726"/>
+          </w:tcPr>
+          <w:p>
+            <w:r>
+              <w:t>박새미</w:t>
+            </w:r>
+          </w:p>
+        </w:tc>
+        <w:tc>
+          <w:tcPr>
+            <w:tcW w:type="dxa" w:w="1701"/>
+            <w:vMerge w:val="restart"/>
+            <w:vAlign w:val="center"/>
+          </w:tcPr>
+          <w:p>
+            <w:pPr>
+              <w:jc w:val="center"/>
+            </w:pPr>
+            <w:r>
+              <w:t>사진 부착</w:t>
+              <w:br/>
+              <w:t>3 × 4 cm</w:t>
+            </w:r>
+          </w:p>
+        </w:tc>
+      </w:tr>
+      <w:tr>
+        <w:trPr>
+          <w:trHeight w:val="454"/>
+        </w:trPr>
+        <w:tc>
+          <w:tcPr>
+            <w:tcW w:type="dxa" w:w="1417"/>
+            <w:shd w:fill="F0F3F6"/>
+          </w:tcPr>
+          <w:p>
+            <w:r>
+              <w:t>소속 / 직위</w:t>
+            </w:r>
+          </w:p>
+        </w:tc>
+        <w:tc>
+          <w:tcPr>
+            <w:tcW w:type="dxa" w:w="5726"/>
+          </w:tcPr>
+          <w:p>
+            <w:r>
+              <w:t>돈스탑 잉글리시 / 운영자</w:t>
+            </w:r>
+          </w:p>
+        </w:tc>
+        <w:tc>
+          <w:tcPr>
+            <w:tcW w:type="dxa" w:w="1701"/>
+            <w:vMerge/>
+          </w:tcPr>
+          <w:p/>
+        </w:tc>
+      </w:tr>
+      <w:tr>
+        <w:trPr>
+          <w:trHeight w:val="454"/>
+        </w:trPr>
+        <w:tc>
+          <w:tcPr>
+            <w:tcW w:type="dxa" w:w="1417"/>
+            <w:shd w:fill="F0F3F6"/>
+          </w:tcPr>
+          <w:p>
+            <w:r>
+              <w:t>연락처</w:t>
+            </w:r>
+          </w:p>
+        </w:tc>
+        <w:tc>
+          <w:tcPr>
+            <w:tcW w:type="dxa" w:w="5726"/>
+          </w:tcPr>
+          <w:p>
+            <w:r/>
+          </w:p>
+        </w:tc>
+        <w:tc>
+          <w:tcPr>
+            <w:tcW w:type="dxa" w:w="1701"/>
+            <w:vMerge/>
+          </w:tcPr>
+          <w:p/>
+        </w:tc>
+      </w:tr>
+      <w:tr>
+        <w:trPr>
+          <w:trHeight w:val="454"/>
+        </w:trPr>
+        <w:tc>
+          <w:tcPr>
+            <w:tcW w:type="dxa" w:w="1417"/>
+            <w:shd w:fill="F0F3F6"/>
+          </w:tcPr>
+          <w:p>
+            <w:r>
+              <w:t>전자우편</w:t>
+            </w:r>
+          </w:p>
+        </w:tc>
+        <w:tc>
+          <w:tcPr>
+            <w:tcW w:type="dxa" w:w="5726"/>
+          </w:tcPr>
+          <w:p>
+            <w:r/>
+          </w:p>
+        </w:tc>
+        <w:tc>
+          <w:tcPr>
+            <w:tcW w:type="dxa" w:w="1701"/>
+            <w:vMerge/>
+          </w:tcPr>
+          <w:p/>
+        </w:tc>
+      </w:tr>
+      <w:tr>
+        <w:trPr>
+          <w:trHeight w:val="454"/>
+        </w:trPr>
+        <w:tc>
+          <w:tcPr>
+            <w:tcW w:type="dxa" w:w="1417"/>
+            <w:shd w:fill="F0F3F6"/>
+          </w:tcPr>
+          <w:p>
+            <w:r>
+              <w:t>활동 지역</w:t>
+            </w:r>
+          </w:p>
+        </w:tc>
+        <w:tc>
+          <w:tcPr>
+            <w:tcW w:type="dxa" w:w="5726"/>
+          </w:tcPr>
+          <w:p>
+            <w:r>
+              <w:t>부천</w:t>
+            </w:r>
+          </w:p>
+        </w:tc>
+        <w:tc>
+          <w:tcPr>
+            <w:tcW w:type="dxa" w:w="1701"/>
+            <w:vMerge/>
+          </w:tcPr>
+          <w:p/>
+        </w:tc>
+      </w:tr>
+    </w:tbl>
+    <w:p>
+      <w:pPr>
+        <w:spacing w:before="180" w:after="100"/>
+      </w:pPr>
+      <w:r>
+        <w:rPr>
+          <w:b/>
+          <w:sz w:val="22"/>
+        </w:rPr>
+        <w:t>1. 학력 사항</w:t>
+      </w:r>
+    </w:p>
+    <w:tbl>
+      <w:tblPr>
+        <w:tblStyle w:val="TableGrid"/>
+        <w:tblW w:type="auto" w:w="0"/>
+        <w:jc w:val="center"/>
+        <w:tblLook w:firstColumn="1" w:firstRow="1" w:lastColumn="0" w:lastRow="0" w:noHBand="0" w:noVBand="1" w:val="04A0"/>
+      </w:tblPr>
+      <w:tblGrid>
+        <w:gridCol w:w="3326"/>
+        <w:gridCol w:w="3326"/>
+        <w:gridCol w:w="3326"/>
+      </w:tblGrid>
+      <w:tr>
+        <w:tc>
+          <w:tcPr>
+            <w:tcW w:type="dxa" w:w="3326"/>
+            <w:shd w:fill="F0F3F6"/>
+          </w:tcPr>
+          <w:p>
+            <w:r>
+              <w:t>기간</w:t>
+            </w:r>
+          </w:p>
+        </w:tc>
+        <w:tc>
+          <w:tcPr>
+            <w:tcW w:type="dxa" w:w="3326"/>
+            <w:shd w:fill="F0F3F6"/>
+          </w:tcPr>
+          <w:p>
+            <w:r>
+              <w:t>학교 / 전공</w:t>
+            </w:r>
+          </w:p>
+        </w:tc>
+        <w:tc>
+          <w:tcPr>
+            <w:tcW w:type="dxa" w:w="3326"/>
+            <w:shd w:fill="F0F3F6"/>
+          </w:tcPr>
+          <w:p>
+            <w:r>
+              <w:t>학위 / 졸업 구분</w:t>
+            </w:r>
+          </w:p>
+        </w:tc>
+      </w:tr>
+      <w:tr>
+        <w:tc>
+          <w:tcPr>
+            <w:tcW w:type="dxa" w:w="3326"/>
+            <w:vAlign w:val="center"/>
+          </w:tcPr>
+          <w:p>
+            <w:pPr>
+              <w:spacing w:after="60" w:before="60"/>
+            </w:pPr>
+            <w:r/>
+          </w:p>
+        </w:tc>
+        <w:tc>
+          <w:tcPr>
+            <w:tcW w:type="dxa" w:w="3326"/>
+            <w:vAlign w:val="center"/>
+          </w:tcPr>
+          <w:p>
+            <w:pPr>
+              <w:spacing w:after="60" w:before="60"/>
+            </w:pPr>
+            <w:r/>
+          </w:p>
+        </w:tc>
+        <w:tc>
+          <w:tcPr>
+            <w:tcW w:type="dxa" w:w="3326"/>
+            <w:vAlign w:val="center"/>
+          </w:tcPr>
+          <w:p>
+            <w:pPr>
+              <w:spacing w:after="60" w:before="60"/>
+            </w:pPr>
+            <w:r/>
+          </w:p>
+        </w:tc>
+      </w:tr>
+      <w:tr>
+        <w:tc>
+          <w:tcPr>
+            <w:tcW w:type="dxa" w:w="3326"/>
+            <w:vAlign w:val="center"/>
+          </w:tcPr>
+          <w:p>
+            <w:pPr>
+              <w:spacing w:after="60" w:before="60"/>
+            </w:pPr>
+            <w:r/>
+          </w:p>
+        </w:tc>
+        <w:tc>
+          <w:tcPr>
+            <w:tcW w:type="dxa" w:w="3326"/>
+            <w:vAlign w:val="center"/>
+          </w:tcPr>
+          <w:p>
+            <w:pPr>
+              <w:spacing w:after="60" w:before="60"/>
+            </w:pPr>
+            <w:r/>
+          </w:p>
+        </w:tc>
+        <w:tc>
+          <w:tcPr>
+            <w:tcW w:type="dxa" w:w="3326"/>
+            <w:vAlign w:val="center"/>
+          </w:tcPr>
+          <w:p>
+            <w:pPr>
+              <w:spacing w:after="60" w:before="60"/>
+            </w:pPr>
+            <w:r/>
+          </w:p>
+        </w:tc>
+      </w:tr>
+    </w:tbl>
+    <w:p>
+      <w:pPr>
+        <w:spacing w:before="180" w:after="100"/>
+      </w:pPr>
+      <w:r>
+        <w:rPr>
+          <w:b/>
+          <w:sz w:val="22"/>
+        </w:rPr>
+        <w:t>2. 주요 경력</w:t>
+      </w:r>
+    </w:p>
+    <w:tbl>
+      <w:tblPr>
+        <w:tblStyle w:val="TableGrid"/>
+        <w:tblW w:type="auto" w:w="0"/>
+        <w:jc w:val="center"/>
+        <w:tblLook w:firstColumn="1" w:firstRow="1" w:lastColumn="0" w:lastRow="0" w:noHBand="0" w:noVBand="1" w:val="04A0"/>
+      </w:tblPr>
+      <w:tblGrid>
+        <w:gridCol w:w="3326"/>
+        <w:gridCol w:w="3326"/>
+        <w:gridCol w:w="3326"/>
+      </w:tblGrid>
+      <w:tr>
+        <w:tc>
+          <w:tcPr>
+            <w:tcW w:type="dxa" w:w="3326"/>
+            <w:shd w:fill="F0F3F6"/>
+          </w:tcPr>
+          <w:p>
+            <w:r>
+              <w:t>기간</w:t>
+            </w:r>
+          </w:p>
+        </w:tc>
+        <w:tc>
+          <w:tcPr>
+            <w:tcW w:type="dxa" w:w="3326"/>
+            <w:shd w:fill="F0F3F6"/>
+          </w:tcPr>
+          <w:p>
+            <w:r>
+              <w:t>기관 / 소속</w:t>
+            </w:r>
+          </w:p>
+        </w:tc>
+        <w:tc>
+          <w:tcPr>
+            <w:tcW w:type="dxa" w:w="3326"/>
+            <w:shd w:fill="F0F3F6"/>
+          </w:tcPr>
+          <w:p>
+            <w:r>
+              <w:t>직위 및 담당 업무</w:t>
+            </w:r>
+          </w:p>
+        </w:tc>
+      </w:tr>
+      <w:tr>
+        <w:tc>
+          <w:tcPr>
+            <w:tcW w:type="dxa" w:w="3326"/>
+            <w:vAlign w:val="center"/>
+          </w:tcPr>
+          <w:p>
+            <w:pPr>
+              <w:spacing w:after="60" w:before="60"/>
+            </w:pPr>
+            <w:r/>
+          </w:p>
+        </w:tc>
+        <w:tc>
+          <w:tcPr>
+            <w:tcW w:type="dxa" w:w="3326"/>
+            <w:vAlign w:val="center"/>
+          </w:tcPr>
+          <w:p>
+            <w:pPr>
+              <w:spacing w:after="60" w:before="60"/>
+            </w:pPr>
+            <w:r/>
+          </w:p>
+        </w:tc>
+        <w:tc>
+          <w:tcPr>
+            <w:tcW w:type="dxa" w:w="3326"/>
+            <w:vAlign w:val="center"/>
+          </w:tcPr>
+          <w:p>
+            <w:pPr>
+              <w:spacing w:after="60" w:before="60"/>
+            </w:pPr>
+            <w:r/>
+          </w:p>
+        </w:tc>
+      </w:tr>
+      <w:tr>
+        <w:tc>
+          <w:tcPr>
+            <w:tcW w:type="dxa" w:w="3326"/>
+            <w:vAlign w:val="center"/>
+          </w:tcPr>
+          <w:p>
+            <w:pPr>
+              <w:spacing w:after="60" w:before="60"/>
+            </w:pPr>
+            <w:r/>
+          </w:p>
+        </w:tc>
+        <w:tc>
+          <w:tcPr>
+            <w:tcW w:type="dxa" w:w="3326"/>
+            <w:vAlign w:val="center"/>
+          </w:tcPr>
+          <w:p>
+            <w:pPr>
+              <w:spacing w:after="60" w:before="60"/>
+            </w:pPr>
+            <w:r/>
+          </w:p>
+        </w:tc>
+        <w:tc>
+          <w:tcPr>
+            <w:tcW w:type="dxa" w:w="3326"/>
+            <w:vAlign w:val="center"/>
+          </w:tcPr>
+          <w:p>
+            <w:pPr>
+              <w:spacing w:after="60" w:before="60"/>
+            </w:pPr>
+            <w:r/>
+          </w:p>
+        </w:tc>
+      </w:tr>
+    </w:tbl>
+    <w:p>
+      <w:pPr>
+        <w:spacing w:before="180" w:after="100"/>
+      </w:pPr>
+      <w:r>
+        <w:rPr>
+          <w:b/>
+          <w:sz w:val="22"/>
+        </w:rPr>
+        <w:t>3. 자격 및 수료</w:t>
+      </w:r>
+    </w:p>
+    <w:tbl>
+      <w:tblPr>
+        <w:tblStyle w:val="TableGrid"/>
+        <w:tblW w:type="auto" w:w="0"/>
+        <w:jc w:val="center"/>
+        <w:tblLook w:firstColumn="1" w:firstRow="1" w:lastColumn="0" w:lastRow="0" w:noHBand="0" w:noVBand="1" w:val="04A0"/>
+      </w:tblPr>
+      <w:tblGrid>
+        <w:gridCol w:w="3326"/>
+        <w:gridCol w:w="3326"/>
+        <w:gridCol w:w="3326"/>
+      </w:tblGrid>
+      <w:tr>
+        <w:tc>
+          <w:tcPr>
+            <w:tcW w:type="dxa" w:w="3326"/>
+            <w:shd w:fill="F0F3F6"/>
+          </w:tcPr>
+          <w:p>
+            <w:r>
+              <w:t>취득 / 수료일</w:t>
+            </w:r>
+          </w:p>
+        </w:tc>
+        <w:tc>
+          <w:tcPr>
+            <w:tcW w:type="dxa" w:w="3326"/>
+            <w:shd w:fill="F0F3F6"/>
+          </w:tcPr>
+          <w:p>
+            <w:r>
+              <w:t>자격·과정명</w:t>
+            </w:r>
+          </w:p>
+        </w:tc>
+        <w:tc>
+          <w:tcPr>
+            <w:tcW w:type="dxa" w:w="3326"/>
+            <w:shd w:fill="F0F3F6"/>
+          </w:tcPr>
+          <w:p>
+            <w:r>
+              <w:t>발급 / 교육 기관</w:t>
+            </w:r>
+          </w:p>
+        </w:tc>
+      </w:tr>
+      <w:tr>
+        <w:tc>
+          <w:tcPr>
+            <w:tcW w:type="dxa" w:w="3326"/>
+            <w:vAlign w:val="center"/>
+          </w:tcPr>
+          <w:p>
+            <w:pPr>
+              <w:spacing w:after="60" w:before="60"/>
+            </w:pPr>
+            <w:r/>
+          </w:p>
+        </w:tc>
+        <w:tc>
+          <w:tcPr>
+            <w:tcW w:type="dxa" w:w="3326"/>
+            <w:vAlign w:val="center"/>
+          </w:tcPr>
+          <w:p>
+            <w:pPr>
+              <w:spacing w:after="60" w:before="60"/>
+            </w:pPr>
+            <w:r/>
+          </w:p>
+        </w:tc>
+        <w:tc>
+          <w:tcPr>
+            <w:tcW w:type="dxa" w:w="3326"/>
+            <w:vAlign w:val="center"/>
+          </w:tcPr>
+          <w:p>
+            <w:pPr>
+              <w:spacing w:after="60" w:before="60"/>
+            </w:pPr>
+            <w:r/>
+          </w:p>
+        </w:tc>
+      </w:tr>
+      <w:tr>
+        <w:tc>
+          <w:tcPr>
+            <w:tcW w:type="dxa" w:w="3326"/>
+            <w:vAlign w:val="center"/>
+          </w:tcPr>
+          <w:p>
+            <w:pPr>
+              <w:spacing w:after="60" w:before="60"/>
+            </w:pPr>
+            <w:r/>
+          </w:p>
+        </w:tc>
+        <w:tc>
+          <w:tcPr>
+            <w:tcW w:type="dxa" w:w="3326"/>
+            <w:vAlign w:val="center"/>
+          </w:tcPr>
+          <w:p>
+            <w:pPr>
+              <w:spacing w:after="60" w:before="60"/>
+            </w:pPr>
+            <w:r/>
+          </w:p>
+        </w:tc>
+        <w:tc>
+          <w:tcPr>
+            <w:tcW w:type="dxa" w:w="3326"/>
+            <w:vAlign w:val="center"/>
+          </w:tcPr>
+          <w:p>
+            <w:pPr>
+              <w:spacing w:after="60" w:before="60"/>
+            </w:pPr>
+            <w:r/>
+          </w:p>
+        </w:tc>
+      </w:tr>
+    </w:tbl>
+    <w:p>
+      <w:pPr>
+        <w:spacing w:before="180" w:after="100"/>
+      </w:pPr>
+      <w:r>
+        <w:rPr>
+          <w:b/>
+          <w:sz w:val="22"/>
+        </w:rPr>
+        <w:t>4. 강의 및 출강 이력</w:t>
+      </w:r>
+    </w:p>
+    <w:tbl>
+      <w:tblPr>
+        <w:tblStyle w:val="TableGrid"/>
+        <w:tblW w:type="auto" w:w="0"/>
+        <w:jc w:val="center"/>
+        <w:tblLook w:firstColumn="1" w:firstRow="1" w:lastColumn="0" w:lastRow="0" w:noHBand="0" w:noVBand="1" w:val="04A0"/>
+      </w:tblPr>
+      <w:tblGrid>
+        <w:gridCol w:w="3326"/>
+        <w:gridCol w:w="3326"/>
+        <w:gridCol w:w="3326"/>
+      </w:tblGrid>
+      <w:tr>
+        <w:tc>
+          <w:tcPr>
+            <w:tcW w:type="dxa" w:w="3326"/>
+            <w:shd w:fill="F0F3F6"/>
+          </w:tcPr>
+          <w:p>
+            <w:r>
+              <w:t>일자 / 기간</w:t>
+            </w:r>
+          </w:p>
+        </w:tc>
+        <w:tc>
+          <w:tcPr>
+            <w:tcW w:type="dxa" w:w="3326"/>
+            <w:shd w:fill="F0F3F6"/>
+          </w:tcPr>
+          <w:p>
+            <w:r>
+              <w:t>기관 / 대상</w:t>
+            </w:r>
+          </w:p>
+        </w:tc>
+        <w:tc>
+          <w:tcPr>
+            <w:tcW w:type="dxa" w:w="3326"/>
+            <w:shd w:fill="F0F3F6"/>
+          </w:tcPr>
+          <w:p>
+            <w:r>
+              <w:t>주제 및 시간</w:t>
+            </w:r>
+          </w:p>
+        </w:tc>
+      </w:tr>
+      <w:tr>
+        <w:tc>
+          <w:tcPr>
+            <w:tcW w:type="dxa" w:w="3326"/>
+            <w:vAlign w:val="center"/>
+          </w:tcPr>
+          <w:p>
+            <w:pPr>
+              <w:spacing w:after="60" w:before="60"/>
+            </w:pPr>
+            <w:r/>
+          </w:p>
+        </w:tc>
+        <w:tc>
+          <w:tcPr>
+            <w:tcW w:type="dxa" w:w="3326"/>
+            <w:vAlign w:val="center"/>
+          </w:tcPr>
+          <w:p>
+            <w:pPr>
+              <w:spacing w:after="60" w:before="60"/>
+            </w:pPr>
+            <w:r/>
+          </w:p>
+        </w:tc>
+        <w:tc>
+          <w:tcPr>
+            <w:tcW w:type="dxa" w:w="3326"/>
+            <w:vAlign w:val="center"/>
+          </w:tcPr>
+          <w:p>
+            <w:pPr>
+              <w:spacing w:after="60" w:before="60"/>
+            </w:pPr>
+            <w:r/>
+          </w:p>
+        </w:tc>
+      </w:tr>
+      <w:tr>
+        <w:tc>
+          <w:tcPr>
+            <w:tcW w:type="dxa" w:w="3326"/>
+            <w:vAlign w:val="center"/>
+          </w:tcPr>
+          <w:p>
+            <w:pPr>
+              <w:spacing w:after="60" w:before="60"/>
+            </w:pPr>
+            <w:r/>
+          </w:p>
+        </w:tc>
+        <w:tc>
+          <w:tcPr>
+            <w:tcW w:type="dxa" w:w="3326"/>
+            <w:vAlign w:val="center"/>
+          </w:tcPr>
+          <w:p>
+            <w:pPr>
+              <w:spacing w:after="60" w:before="60"/>
+            </w:pPr>
+            <w:r/>
+          </w:p>
+        </w:tc>
+        <w:tc>
+          <w:tcPr>
+            <w:tcW w:type="dxa" w:w="3326"/>
+            <w:vAlign w:val="center"/>
+          </w:tcPr>
+          <w:p>
+            <w:pPr>
+              <w:spacing w:after="60" w:before="60"/>
+            </w:pPr>
+            <w:r/>
+          </w:p>
+        </w:tc>
+      </w:tr>
+    </w:tbl>
+    <w:p>
+      <w:pPr>
+        <w:spacing w:before="180" w:after="100"/>
+      </w:pPr>
+      <w:r>
+        <w:rPr>
+          <w:b/>
+          <w:sz w:val="22"/>
+        </w:rPr>
+        <w:t>5. 강의 분야 및 운영 제안</w:t>
+      </w:r>
+    </w:p>
+    <w:tbl>
+      <w:tblPr>
+        <w:tblStyle w:val="TableGrid"/>
+        <w:tblW w:type="auto" w:w="0"/>
+        <w:jc w:val="center"/>
+        <w:tblLook w:firstColumn="1" w:firstRow="1" w:lastColumn="0" w:lastRow="0" w:noHBand="0" w:noVBand="1" w:val="04A0"/>
+      </w:tblPr>
+      <w:tblGrid>
+        <w:gridCol w:w="4989"/>
+        <w:gridCol w:w="4989"/>
+      </w:tblGrid>
+      <w:tr>
+        <w:tc>
+          <w:tcPr>
+            <w:tcW w:type="dxa" w:w="4989"/>
+            <w:shd w:fill="F0F3F6"/>
+          </w:tcPr>
+          <w:p>
+            <w:r>
+              <w:t>구분</w:t>
+            </w:r>
+          </w:p>
+        </w:tc>
+        <w:tc>
+          <w:tcPr>
+            <w:tcW w:type="dxa" w:w="4989"/>
+            <w:shd w:fill="F0F3F6"/>
+          </w:tcPr>
+          <w:p>
+            <w:r>
+              <w:t>내용</w:t>
+            </w:r>
+          </w:p>
+        </w:tc>
+      </w:tr>
+      <w:tr>
+        <w:tc>
+          <w:tcPr>
+            <w:tcW w:type="dxa" w:w="4989"/>
+            <w:vAlign w:val="center"/>
+          </w:tcPr>
+          <w:p>
+            <w:pPr>
+              <w:spacing w:after="60" w:before="60"/>
+            </w:pPr>
+            <w:r>
+              <w:t>강의 분야</w:t>
+            </w:r>
+          </w:p>
+        </w:tc>
+        <w:tc>
+          <w:tcPr>
+            <w:tcW w:type="dxa" w:w="4989"/>
+            <w:vAlign w:val="center"/>
+          </w:tcPr>
+          <w:p>
+            <w:pPr>
+              <w:spacing w:after="60" w:before="60"/>
+            </w:pPr>
+            <w:r>
+              <w:t>생활·여행 영어</w:t>
+            </w:r>
+          </w:p>
+        </w:tc>
+      </w:tr>
+      <w:tr>
+        <w:tc>
+          <w:tcPr>
+            <w:tcW w:type="dxa" w:w="4989"/>
+            <w:vAlign w:val="center"/>
+          </w:tcPr>
+          <w:p>
+            <w:pPr>
+              <w:spacing w:after="60" w:before="60"/>
+            </w:pPr>
+            <w:r>
+              <w:t>대상 / 형태</w:t>
+            </w:r>
+          </w:p>
+        </w:tc>
+        <w:tc>
+          <w:tcPr>
+            <w:tcW w:type="dxa" w:w="4989"/>
+            <w:vAlign w:val="center"/>
+          </w:tcPr>
+          <w:p>
+            <w:pPr>
+              <w:spacing w:after="60" w:before="60"/>
+            </w:pPr>
+            <w:r>
+              <w:t>중장년·어르신 / 2~3인 모임 또는 10명 이상 단체</w:t>
+            </w:r>
+          </w:p>
+        </w:tc>
+      </w:tr>
+      <w:tr>
+        <w:tc>
+          <w:tcPr>
+            <w:tcW w:type="dxa" w:w="4989"/>
+            <w:vAlign w:val="center"/>
+          </w:tcPr>
+          <w:p>
+            <w:pPr>
+              <w:spacing w:after="60" w:before="60"/>
+            </w:pPr>
+            <w:r>
+              <w:t>시간 / 지역</w:t>
+            </w:r>
+          </w:p>
+        </w:tc>
+        <w:tc>
+          <w:tcPr>
+            <w:tcW w:type="dxa" w:w="4989"/>
+            <w:vAlign w:val="center"/>
+          </w:tcPr>
+          <w:p>
+            <w:pPr>
+              <w:spacing w:after="60" w:before="60"/>
+            </w:pPr>
+            <w:r>
+              <w:t>60~120분 / 부천 중심 · 세부 조건 협의</w:t>
+            </w:r>
+          </w:p>
+        </w:tc>
+      </w:tr>
+    </w:tbl>
     <w:p>
       <w:r>
-        <w:t>천천히, 편안하게, 생활 가까이</w:t>
-      </w:r>
-    </w:p>
-    <w:p>
-      <w:pPr>
-        <w:pStyle w:val="Heading2"/>
-      </w:pPr>
-      <w:r>
-        <w:t>영어로 해보고 싶은 말이 있나요</w:t>
-      </w:r>
-    </w:p>
-    <w:p>
-      <w:r>
-        <w:t>여행지에서 커피를 주문하고 싶을 때, 길을 묻고 싶을 때, 처음 만난 사람에게 인사를 건네고 싶을 때. 돈스탑 잉글리시를 운영하는 박새미와 함께 필요한 장면을 골라 말해보는 수업을 제안합니다.</w:t>
-      </w:r>
-    </w:p>
-    <w:p>
-      <w:pPr>
-        <w:pStyle w:val="Heading2"/>
-      </w:pPr>
-      <w:r>
-        <w:t>수업에서는 이렇게 함께합니다</w:t>
-      </w:r>
-    </w:p>
-    <w:p>
-      <w:r>
-        <w:t>먼저 한국어로 상황을 살펴봅니다.</w:t>
-        <w:br/>
-        <w:t>큰 글씨로 짧은 표현을 만나고 함께 소리 내어 읽습니다.</w:t>
-        <w:br/>
-        <w:t>원하면 짝과 연습하고, 오늘 배운 말을 한 장에 정리합니다.</w:t>
-        <w:br/>
-        <w:t>공개 발표나 스마트폰 사용은 필수가 아닙니다.</w:t>
-      </w:r>
-    </w:p>
-    <w:p>
-      <w:pPr>
-        <w:pStyle w:val="Heading2"/>
-      </w:pPr>
-      <w:r>
-        <w:t>함께 배우는 방법</w:t>
-      </w:r>
-    </w:p>
-    <w:p>
-      <w:r>
-        <w:t>친구나 가족 두세 분과 작은 영어 모임</w:t>
-        <w:br/>
-        <w:t>10명 이상이 함께하는 생활·여행 영어 특강</w:t>
-        <w:br/>
-        <w:t>1~2시간 안에서 참여자의 목적에 맞춰 활동을 조정합니다.</w:t>
-      </w:r>
-    </w:p>
-    <w:p>
-      <w:pPr>
-        <w:pStyle w:val="Heading2"/>
-      </w:pPr>
-      <w:r>
-        <w:t>처음에는 이야기부터 나눕니다</w:t>
-      </w:r>
-    </w:p>
-    <w:p>
-      <w:r>
-        <w:t>배우고 싶은 장면, 함께할 인원, 편한 시간대와 장소를 알려주세요. 수업 참여와 활동 방식은 자율이며, 일정과 장소, 비용은 협의 후 확정합니다.</w:t>
-      </w:r>
-    </w:p>
-    <w:p>
-      <w:r>
-        <w:t>출강 문의 · 돈스탑 잉글리시 카카오톡 채널</w:t>
-        <w:br/>
-        <w:t>https://pf.kakao.com/_cDxaKn/chat</w:t>
-        <w:br/>
-        <w:t>출강 구성 제안 · 주제, 일정, 장소, 비용과 운영 조건은 협의 후 확정합니다.</w:t>
+        <w:t>작성일:                    작성자: 박새미</w:t>
       </w:r>
     </w:p>
     <w:sectPr>
-      <w:pgSz w:w="12240" w:h="15840"/>
-      <w:pgMar w:top="1080" w:right="1080" w:bottom="936" w:left="1080" w:header="720" w:footer="720" w:gutter="0"/>
+      <w:pgSz w:w="11906" w:h="16838"/>
+      <w:pgMar w:top="850" w:right="964" w:bottom="850" w:left="964" w:header="720" w:footer="720" w:gutter="0"/>
       <w:cols w:space="720"/>
       <w:docGrid w:linePitch="360"/>
     </w:sectPr>
@@ -467,9 +1266,12 @@
     <w:name w:val="Normal"/>
     <w:qFormat/>
     <w:rsid w:val="00FC693F"/>
+    <w:pPr>
+      <w:spacing w:after="60"/>
+    </w:pPr>
     <w:rPr>
       <w:rFonts w:ascii="Malgun Gothic" w:hAnsi="Malgun Gothic" w:eastAsia="Malgun Gothic"/>
-      <w:sz w:val="20"/>
+      <w:sz w:val="18"/>
     </w:rPr>
   </w:style>
   <w:style w:type="paragraph" w:styleId="Header">
@@ -488,7 +1290,7 @@
     </w:pPr>
     <w:rPr>
       <w:rFonts w:ascii="Malgun Gothic" w:hAnsi="Malgun Gothic" w:eastAsia="Malgun Gothic"/>
-      <w:sz w:val="20"/>
+      <w:sz w:val="18"/>
     </w:rPr>
   </w:style>
   <w:style w:type="character" w:customStyle="1" w:styleId="HeaderChar">
@@ -499,7 +1301,7 @@
     <w:rsid w:val="00E618BF"/>
     <w:rPr>
       <w:rFonts w:ascii="Malgun Gothic" w:hAnsi="Malgun Gothic" w:eastAsia="Malgun Gothic"/>
-      <w:sz w:val="20"/>
+      <w:sz w:val="18"/>
     </w:rPr>
   </w:style>
   <w:style w:type="paragraph" w:styleId="Footer">
@@ -518,7 +1320,7 @@
     </w:pPr>
     <w:rPr>
       <w:rFonts w:ascii="Malgun Gothic" w:hAnsi="Malgun Gothic" w:eastAsia="Malgun Gothic"/>
-      <w:sz w:val="20"/>
+      <w:sz w:val="18"/>
     </w:rPr>
   </w:style>
   <w:style w:type="character" w:customStyle="1" w:styleId="FooterChar">
@@ -529,7 +1331,7 @@
     <w:rsid w:val="00E618BF"/>
     <w:rPr>
       <w:rFonts w:ascii="Malgun Gothic" w:hAnsi="Malgun Gothic" w:eastAsia="Malgun Gothic"/>
-      <w:sz w:val="20"/>
+      <w:sz w:val="18"/>
     </w:rPr>
   </w:style>
   <w:style w:type="paragraph" w:styleId="Heading1">
@@ -551,7 +1353,7 @@
       <w:b/>
       <w:bCs/>
       <w:color w:val="365F91" w:themeColor="accent1" w:themeShade="BF"/>
-      <w:sz w:val="20"/>
+      <w:sz w:val="18"/>
       <w:szCs w:val="28"/>
     </w:rPr>
   </w:style>
@@ -575,7 +1377,7 @@
       <w:b/>
       <w:bCs/>
       <w:color w:val="4F81BD" w:themeColor="accent1"/>
-      <w:sz w:val="20"/>
+      <w:sz w:val="18"/>
       <w:szCs w:val="26"/>
     </w:rPr>
   </w:style>
@@ -599,7 +1401,7 @@
       <w:b/>
       <w:bCs/>
       <w:color w:val="4F81BD" w:themeColor="accent1"/>
-      <w:sz w:val="20"/>
+      <w:sz w:val="18"/>
     </w:rPr>
   </w:style>
   <w:style w:type="paragraph" w:styleId="Heading4">
@@ -625,7 +1427,7 @@
       <w:i/>
       <w:iCs/>
       <w:color w:val="4F81BD" w:themeColor="accent1"/>
-      <w:sz w:val="20"/>
+      <w:sz w:val="18"/>
     </w:rPr>
   </w:style>
   <w:style w:type="paragraph" w:styleId="Heading5">
@@ -647,7 +1449,7 @@
     <w:rPr>
       <w:rFonts w:asciiTheme="majorHAnsi" w:eastAsiaTheme="majorEastAsia" w:hAnsiTheme="majorHAnsi" w:cstheme="majorBidi" w:ascii="Malgun Gothic" w:hAnsi="Malgun Gothic" w:eastAsia="Malgun Gothic"/>
       <w:color w:val="243F60" w:themeColor="accent1" w:themeShade="7F"/>
-      <w:sz w:val="20"/>
+      <w:sz w:val="18"/>
     </w:rPr>
   </w:style>
   <w:style w:type="paragraph" w:styleId="Heading6">
@@ -671,7 +1473,7 @@
       <w:i/>
       <w:iCs/>
       <w:color w:val="243F60" w:themeColor="accent1" w:themeShade="7F"/>
-      <w:sz w:val="20"/>
+      <w:sz w:val="18"/>
     </w:rPr>
   </w:style>
   <w:style w:type="paragraph" w:styleId="Heading7">
@@ -695,7 +1497,7 @@
       <w:i/>
       <w:iCs/>
       <w:color w:val="404040" w:themeColor="text1" w:themeTint="BF"/>
-      <w:sz w:val="20"/>
+      <w:sz w:val="18"/>
     </w:rPr>
   </w:style>
   <w:style w:type="paragraph" w:styleId="Heading8">
@@ -717,7 +1519,7 @@
     <w:rPr>
       <w:rFonts w:asciiTheme="majorHAnsi" w:eastAsiaTheme="majorEastAsia" w:hAnsiTheme="majorHAnsi" w:cstheme="majorBidi" w:ascii="Malgun Gothic" w:hAnsi="Malgun Gothic" w:eastAsia="Malgun Gothic"/>
       <w:color w:val="4F81BD" w:themeColor="accent1"/>
-      <w:sz w:val="20"/>
+      <w:sz w:val="18"/>
       <w:szCs w:val="20"/>
     </w:rPr>
   </w:style>
@@ -742,7 +1544,7 @@
       <w:i/>
       <w:iCs/>
       <w:color w:val="404040" w:themeColor="text1" w:themeTint="BF"/>
-      <w:sz w:val="20"/>
+      <w:sz w:val="18"/>
       <w:szCs w:val="20"/>
     </w:rPr>
   </w:style>
@@ -753,7 +1555,7 @@
     <w:unhideWhenUsed/>
     <w:rPr>
       <w:rFonts w:ascii="Malgun Gothic" w:hAnsi="Malgun Gothic" w:eastAsia="Malgun Gothic"/>
-      <w:sz w:val="20"/>
+      <w:sz w:val="18"/>
     </w:rPr>
   </w:style>
   <w:style w:type="table" w:default="1" w:styleId="TableNormal">
@@ -787,7 +1589,7 @@
     </w:pPr>
     <w:rPr>
       <w:rFonts w:ascii="Malgun Gothic" w:hAnsi="Malgun Gothic" w:eastAsia="Malgun Gothic"/>
-      <w:sz w:val="20"/>
+      <w:sz w:val="18"/>
     </w:rPr>
   </w:style>
   <w:style w:type="character" w:customStyle="1" w:styleId="Heading1Char">
@@ -801,7 +1603,7 @@
       <w:b/>
       <w:bCs/>
       <w:color w:val="365F91" w:themeColor="accent1" w:themeShade="BF"/>
-      <w:sz w:val="20"/>
+      <w:sz w:val="18"/>
       <w:szCs w:val="28"/>
     </w:rPr>
   </w:style>
@@ -816,7 +1618,7 @@
       <w:b/>
       <w:bCs/>
       <w:color w:val="4F81BD" w:themeColor="accent1"/>
-      <w:sz w:val="20"/>
+      <w:sz w:val="18"/>
       <w:szCs w:val="26"/>
     </w:rPr>
   </w:style>
@@ -831,7 +1633,7 @@
       <w:b/>
       <w:bCs/>
       <w:color w:val="4F81BD" w:themeColor="accent1"/>
-      <w:sz w:val="20"/>
+      <w:sz w:val="18"/>
     </w:rPr>
   </w:style>
   <w:style w:type="paragraph" w:styleId="Title">
@@ -854,7 +1656,7 @@
       <w:color w:val="17365D" w:themeColor="text2" w:themeShade="BF"/>
       <w:spacing w:val="5"/>
       <w:kern w:val="28"/>
-      <w:sz w:val="20"/>
+      <w:sz w:val="18"/>
       <w:szCs w:val="52"/>
     </w:rPr>
   </w:style>
@@ -869,7 +1671,7 @@
       <w:color w:val="17365D" w:themeColor="text2" w:themeShade="BF"/>
       <w:spacing w:val="5"/>
       <w:kern w:val="28"/>
-      <w:sz w:val="20"/>
+      <w:sz w:val="18"/>
       <w:szCs w:val="52"/>
     </w:rPr>
   </w:style>
@@ -892,7 +1694,7 @@
       <w:iCs/>
       <w:color w:val="4F81BD" w:themeColor="accent1"/>
       <w:spacing w:val="15"/>
-      <w:sz w:val="20"/>
+      <w:sz w:val="18"/>
       <w:szCs w:val="24"/>
     </w:rPr>
   </w:style>
@@ -908,7 +1710,7 @@
       <w:iCs/>
       <w:color w:val="4F81BD" w:themeColor="accent1"/>
       <w:spacing w:val="15"/>
-      <w:sz w:val="20"/>
+      <w:sz w:val="18"/>
       <w:szCs w:val="24"/>
     </w:rPr>
   </w:style>
@@ -924,7 +1726,7 @@
     </w:pPr>
     <w:rPr>
       <w:rFonts w:ascii="Malgun Gothic" w:hAnsi="Malgun Gothic" w:eastAsia="Malgun Gothic"/>
-      <w:sz w:val="20"/>
+      <w:sz w:val="18"/>
     </w:rPr>
   </w:style>
   <w:style w:type="paragraph" w:styleId="BodyText">
@@ -939,7 +1741,7 @@
     </w:pPr>
     <w:rPr>
       <w:rFonts w:ascii="Malgun Gothic" w:hAnsi="Malgun Gothic" w:eastAsia="Malgun Gothic"/>
-      <w:sz w:val="20"/>
+      <w:sz w:val="18"/>
     </w:rPr>
   </w:style>
   <w:style w:type="character" w:customStyle="1" w:styleId="BodyTextChar">
@@ -950,7 +1752,7 @@
     <w:rsid w:val="00AA1D8D"/>
     <w:rPr>
       <w:rFonts w:ascii="Malgun Gothic" w:hAnsi="Malgun Gothic" w:eastAsia="Malgun Gothic"/>
-      <w:sz w:val="20"/>
+      <w:sz w:val="18"/>
     </w:rPr>
   </w:style>
   <w:style w:type="paragraph" w:styleId="BodyText2">
@@ -965,7 +1767,7 @@
     </w:pPr>
     <w:rPr>
       <w:rFonts w:ascii="Malgun Gothic" w:hAnsi="Malgun Gothic" w:eastAsia="Malgun Gothic"/>
-      <w:sz w:val="20"/>
+      <w:sz w:val="18"/>
     </w:rPr>
   </w:style>
   <w:style w:type="character" w:customStyle="1" w:styleId="BodyText2Char">
@@ -976,7 +1778,7 @@
     <w:rsid w:val="00AA1D8D"/>
     <w:rPr>
       <w:rFonts w:ascii="Malgun Gothic" w:hAnsi="Malgun Gothic" w:eastAsia="Malgun Gothic"/>
-      <w:sz w:val="20"/>
+      <w:sz w:val="18"/>
     </w:rPr>
   </w:style>
   <w:style w:type="paragraph" w:styleId="BodyText3">
@@ -991,7 +1793,7 @@
     </w:pPr>
     <w:rPr>
       <w:rFonts w:ascii="Malgun Gothic" w:hAnsi="Malgun Gothic" w:eastAsia="Malgun Gothic"/>
-      <w:sz w:val="20"/>
+      <w:sz w:val="18"/>
       <w:szCs w:val="16"/>
     </w:rPr>
   </w:style>
@@ -1003,7 +1805,7 @@
     <w:rsid w:val="00AA1D8D"/>
     <w:rPr>
       <w:rFonts w:ascii="Malgun Gothic" w:hAnsi="Malgun Gothic" w:eastAsia="Malgun Gothic"/>
-      <w:sz w:val="20"/>
+      <w:sz w:val="18"/>
       <w:szCs w:val="16"/>
     </w:rPr>
   </w:style>
@@ -1019,7 +1821,7 @@
     </w:pPr>
     <w:rPr>
       <w:rFonts w:ascii="Malgun Gothic" w:hAnsi="Malgun Gothic" w:eastAsia="Malgun Gothic"/>
-      <w:sz w:val="20"/>
+      <w:sz w:val="18"/>
     </w:rPr>
   </w:style>
   <w:style w:type="paragraph" w:styleId="List2">
@@ -1034,7 +1836,7 @@
     </w:pPr>
     <w:rPr>
       <w:rFonts w:ascii="Malgun Gothic" w:hAnsi="Malgun Gothic" w:eastAsia="Malgun Gothic"/>
-      <w:sz w:val="20"/>
+      <w:sz w:val="18"/>
     </w:rPr>
   </w:style>
   <w:style w:type="paragraph" w:styleId="List3">
@@ -1049,7 +1851,7 @@
     </w:pPr>
     <w:rPr>
       <w:rFonts w:ascii="Malgun Gothic" w:hAnsi="Malgun Gothic" w:eastAsia="Malgun Gothic"/>
-      <w:sz w:val="20"/>
+      <w:sz w:val="18"/>
     </w:rPr>
   </w:style>
   <w:style w:type="paragraph" w:styleId="ListBullet">
@@ -1066,7 +1868,7 @@
     </w:pPr>
     <w:rPr>
       <w:rFonts w:ascii="Malgun Gothic" w:hAnsi="Malgun Gothic" w:eastAsia="Malgun Gothic"/>
-      <w:sz w:val="20"/>
+      <w:sz w:val="18"/>
     </w:rPr>
   </w:style>
   <w:style w:type="paragraph" w:styleId="ListBullet2">
@@ -1083,7 +1885,7 @@
     </w:pPr>
     <w:rPr>
       <w:rFonts w:ascii="Malgun Gothic" w:hAnsi="Malgun Gothic" w:eastAsia="Malgun Gothic"/>
-      <w:sz w:val="20"/>
+      <w:sz w:val="18"/>
     </w:rPr>
   </w:style>
   <w:style w:type="paragraph" w:styleId="ListBullet3">
@@ -1100,7 +1902,7 @@
     </w:pPr>
     <w:rPr>
       <w:rFonts w:ascii="Malgun Gothic" w:hAnsi="Malgun Gothic" w:eastAsia="Malgun Gothic"/>
-      <w:sz w:val="20"/>
+      <w:sz w:val="18"/>
     </w:rPr>
   </w:style>
   <w:style w:type="paragraph" w:styleId="ListNumber">
@@ -1117,7 +1919,7 @@
     </w:pPr>
     <w:rPr>
       <w:rFonts w:ascii="Malgun Gothic" w:hAnsi="Malgun Gothic" w:eastAsia="Malgun Gothic"/>
-      <w:sz w:val="20"/>
+      <w:sz w:val="18"/>
     </w:rPr>
   </w:style>
   <w:style w:type="paragraph" w:styleId="ListNumber2">
@@ -1134,7 +1936,7 @@
     </w:pPr>
     <w:rPr>
       <w:rFonts w:ascii="Malgun Gothic" w:hAnsi="Malgun Gothic" w:eastAsia="Malgun Gothic"/>
-      <w:sz w:val="20"/>
+      <w:sz w:val="18"/>
     </w:rPr>
   </w:style>
   <w:style w:type="paragraph" w:styleId="ListNumber3">
@@ -1151,7 +1953,7 @@
     </w:pPr>
     <w:rPr>
       <w:rFonts w:ascii="Malgun Gothic" w:hAnsi="Malgun Gothic" w:eastAsia="Malgun Gothic"/>
-      <w:sz w:val="20"/>
+      <w:sz w:val="18"/>
     </w:rPr>
   </w:style>
   <w:style w:type="paragraph" w:styleId="ListContinue">
@@ -1167,7 +1969,7 @@
     </w:pPr>
     <w:rPr>
       <w:rFonts w:ascii="Malgun Gothic" w:hAnsi="Malgun Gothic" w:eastAsia="Malgun Gothic"/>
-      <w:sz w:val="20"/>
+      <w:sz w:val="18"/>
     </w:rPr>
   </w:style>
   <w:style w:type="paragraph" w:styleId="ListContinue2">
@@ -1183,7 +1985,7 @@
     </w:pPr>
     <w:rPr>
       <w:rFonts w:ascii="Malgun Gothic" w:hAnsi="Malgun Gothic" w:eastAsia="Malgun Gothic"/>
-      <w:sz w:val="20"/>
+      <w:sz w:val="18"/>
     </w:rPr>
   </w:style>
   <w:style w:type="paragraph" w:styleId="ListContinue3">
@@ -1199,7 +2001,7 @@
     </w:pPr>
     <w:rPr>
       <w:rFonts w:ascii="Malgun Gothic" w:hAnsi="Malgun Gothic" w:eastAsia="Malgun Gothic"/>
-      <w:sz w:val="20"/>
+      <w:sz w:val="18"/>
     </w:rPr>
   </w:style>
   <w:style w:type="paragraph" w:styleId="MacroText">
@@ -1221,7 +2023,7 @@
     </w:pPr>
     <w:rPr>
       <w:rFonts w:ascii="Malgun Gothic" w:hAnsi="Malgun Gothic" w:eastAsia="Malgun Gothic"/>
-      <w:sz w:val="20"/>
+      <w:sz w:val="18"/>
       <w:szCs w:val="20"/>
     </w:rPr>
   </w:style>
@@ -1233,7 +2035,7 @@
     <w:rsid w:val="0029639D"/>
     <w:rPr>
       <w:rFonts w:ascii="Malgun Gothic" w:hAnsi="Malgun Gothic" w:eastAsia="Malgun Gothic"/>
-      <w:sz w:val="20"/>
+      <w:sz w:val="18"/>
       <w:szCs w:val="20"/>
     </w:rPr>
   </w:style>
@@ -1250,7 +2052,7 @@
       <w:i/>
       <w:iCs/>
       <w:color w:val="000000" w:themeColor="text1"/>
-      <w:sz w:val="20"/>
+      <w:sz w:val="18"/>
     </w:rPr>
   </w:style>
   <w:style w:type="character" w:customStyle="1" w:styleId="QuoteChar">
@@ -1264,7 +2066,7 @@
       <w:i/>
       <w:iCs/>
       <w:color w:val="000000" w:themeColor="text1"/>
-      <w:sz w:val="20"/>
+      <w:sz w:val="18"/>
     </w:rPr>
   </w:style>
   <w:style w:type="character" w:customStyle="1" w:styleId="Heading4Char">
@@ -1281,7 +2083,7 @@
       <w:i/>
       <w:iCs/>
       <w:color w:val="4F81BD" w:themeColor="accent1"/>
-      <w:sz w:val="20"/>
+      <w:sz w:val="18"/>
     </w:rPr>
   </w:style>
   <w:style w:type="character" w:customStyle="1" w:styleId="Heading5Char">
@@ -1294,7 +2096,7 @@
     <w:rPr>
       <w:rFonts w:asciiTheme="majorHAnsi" w:eastAsiaTheme="majorEastAsia" w:hAnsiTheme="majorHAnsi" w:cstheme="majorBidi" w:ascii="Malgun Gothic" w:hAnsi="Malgun Gothic" w:eastAsia="Malgun Gothic"/>
       <w:color w:val="243F60" w:themeColor="accent1" w:themeShade="7F"/>
-      <w:sz w:val="20"/>
+      <w:sz w:val="18"/>
     </w:rPr>
   </w:style>
   <w:style w:type="character" w:customStyle="1" w:styleId="Heading6Char">
@@ -1309,7 +2111,7 @@
       <w:i/>
       <w:iCs/>
       <w:color w:val="243F60" w:themeColor="accent1" w:themeShade="7F"/>
-      <w:sz w:val="20"/>
+      <w:sz w:val="18"/>
     </w:rPr>
   </w:style>
   <w:style w:type="character" w:customStyle="1" w:styleId="Heading7Char">
@@ -1324,7 +2126,7 @@
       <w:i/>
       <w:iCs/>
       <w:color w:val="404040" w:themeColor="text1" w:themeTint="BF"/>
-      <w:sz w:val="20"/>
+      <w:sz w:val="18"/>
     </w:rPr>
   </w:style>
   <w:style w:type="character" w:customStyle="1" w:styleId="Heading8Char">
@@ -1337,7 +2139,7 @@
     <w:rPr>
       <w:rFonts w:asciiTheme="majorHAnsi" w:eastAsiaTheme="majorEastAsia" w:hAnsiTheme="majorHAnsi" w:cstheme="majorBidi" w:ascii="Malgun Gothic" w:hAnsi="Malgun Gothic" w:eastAsia="Malgun Gothic"/>
       <w:color w:val="4F81BD" w:themeColor="accent1"/>
-      <w:sz w:val="20"/>
+      <w:sz w:val="18"/>
       <w:szCs w:val="20"/>
     </w:rPr>
   </w:style>
@@ -1353,7 +2155,7 @@
       <w:i/>
       <w:iCs/>
       <w:color w:val="404040" w:themeColor="text1" w:themeTint="BF"/>
-      <w:sz w:val="20"/>
+      <w:sz w:val="18"/>
       <w:szCs w:val="20"/>
     </w:rPr>
   </w:style>
@@ -1374,7 +2176,7 @@
       <w:b/>
       <w:bCs/>
       <w:color w:val="4F81BD" w:themeColor="accent1"/>
-      <w:sz w:val="20"/>
+      <w:sz w:val="18"/>
       <w:szCs w:val="18"/>
     </w:rPr>
   </w:style>
@@ -1388,7 +2190,7 @@
       <w:rFonts w:ascii="Malgun Gothic" w:hAnsi="Malgun Gothic" w:eastAsia="Malgun Gothic"/>
       <w:b/>
       <w:bCs/>
-      <w:sz w:val="20"/>
+      <w:sz w:val="18"/>
     </w:rPr>
   </w:style>
   <w:style w:type="character" w:styleId="Emphasis">
@@ -1401,7 +2203,7 @@
       <w:rFonts w:ascii="Malgun Gothic" w:hAnsi="Malgun Gothic" w:eastAsia="Malgun Gothic"/>
       <w:i/>
       <w:iCs/>
-      <w:sz w:val="20"/>
+      <w:sz w:val="18"/>
     </w:rPr>
   </w:style>
   <w:style w:type="paragraph" w:styleId="IntenseQuote">
@@ -1426,7 +2228,7 @@
       <w:i/>
       <w:iCs/>
       <w:color w:val="4F81BD" w:themeColor="accent1"/>
-      <w:sz w:val="20"/>
+      <w:sz w:val="18"/>
     </w:rPr>
   </w:style>
   <w:style w:type="character" w:customStyle="1" w:styleId="IntenseQuoteChar">
@@ -1442,7 +2244,7 @@
       <w:i/>
       <w:iCs/>
       <w:color w:val="4F81BD" w:themeColor="accent1"/>
-      <w:sz w:val="20"/>
+      <w:sz w:val="18"/>
     </w:rPr>
   </w:style>
   <w:style w:type="character" w:styleId="SubtleEmphasis">
@@ -1456,7 +2258,7 @@
       <w:i/>
       <w:iCs/>
       <w:color w:val="808080" w:themeColor="text1" w:themeTint="7F"/>
-      <w:sz w:val="20"/>
+      <w:sz w:val="18"/>
     </w:rPr>
   </w:style>
   <w:style w:type="character" w:styleId="IntenseEmphasis">
@@ -1472,7 +2274,7 @@
       <w:i/>
       <w:iCs/>
       <w:color w:val="4F81BD" w:themeColor="accent1"/>
-      <w:sz w:val="20"/>
+      <w:sz w:val="18"/>
     </w:rPr>
   </w:style>
   <w:style w:type="character" w:styleId="SubtleReference">
@@ -1485,7 +2287,7 @@
       <w:rFonts w:ascii="Malgun Gothic" w:hAnsi="Malgun Gothic" w:eastAsia="Malgun Gothic"/>
       <w:smallCaps/>
       <w:color w:val="C0504D" w:themeColor="accent2"/>
-      <w:sz w:val="20"/>
+      <w:sz w:val="18"/>
       <w:u w:val="single"/>
     </w:rPr>
   </w:style>
@@ -1502,7 +2304,7 @@
       <w:smallCaps/>
       <w:color w:val="C0504D" w:themeColor="accent2"/>
       <w:spacing w:val="5"/>
-      <w:sz w:val="20"/>
+      <w:sz w:val="18"/>
       <w:u w:val="single"/>
     </w:rPr>
   </w:style>
@@ -1518,7 +2320,7 @@
       <w:bCs/>
       <w:smallCaps/>
       <w:spacing w:val="5"/>
-      <w:sz w:val="20"/>
+      <w:sz w:val="18"/>
     </w:rPr>
   </w:style>
   <w:style w:type="paragraph" w:styleId="TOCHeading">
@@ -1535,7 +2337,7 @@
     </w:pPr>
     <w:rPr>
       <w:rFonts w:ascii="Malgun Gothic" w:hAnsi="Malgun Gothic" w:eastAsia="Malgun Gothic"/>
-      <w:sz w:val="20"/>
+      <w:sz w:val="18"/>
     </w:rPr>
   </w:style>
   <w:style w:type="table" w:styleId="TableGrid">

</xml_diff>

<commit_message>
Include completion guidance in editable profile footers
</commit_message>
<xml_diff>
--- a/public/dontstop-lecture/profile-friendly.docx
+++ b/public/dontstop-lecture/profile-friendly.docx
@@ -894,6 +894,7 @@
       </w:r>
     </w:p>
     <w:sectPr>
+      <w:footerReference w:type="default" r:id="rId9"/>
       <w:pgSz w:w="11906" w:h="16838"/>
       <w:pgMar w:top="850" w:right="964" w:bottom="850" w:left="964" w:header="720" w:footer="720" w:gutter="0"/>
       <w:cols w:space="720"/>
@@ -901,6 +902,24 @@
     </w:sectPr>
   </w:body>
 </w:document>
+</file>
+
+<file path=word/footer1.xml><?xml version="1.0" encoding="utf-8"?>
+<w:ftr xmlns:m="http://schemas.openxmlformats.org/officeDocument/2006/math" xmlns:mc="http://schemas.openxmlformats.org/markup-compatibility/2006" xmlns:mo="http://schemas.microsoft.com/office/mac/office/2008/main" xmlns:mv="urn:schemas-microsoft-com:mac:vml" xmlns:o="urn:schemas-microsoft-com:office:office" xmlns:r="http://schemas.openxmlformats.org/officeDocument/2006/relationships" xmlns:v="urn:schemas-microsoft-com:vml" xmlns:w10="urn:schemas-microsoft-com:office:word" xmlns:w14="http://schemas.microsoft.com/office/word/2010/wordml" xmlns:w="http://schemas.openxmlformats.org/wordprocessingml/2006/main" xmlns:wne="http://schemas.microsoft.com/office/word/2006/wordml" xmlns:wp14="http://schemas.microsoft.com/office/word/2010/wordprocessingDrawing" xmlns:wp="http://schemas.openxmlformats.org/drawingml/2006/wordprocessingDrawing" xmlns:wpc="http://schemas.microsoft.com/office/word/2010/wordprocessingCanvas" xmlns:wpg="http://schemas.microsoft.com/office/word/2010/wordprocessingGroup" xmlns:wpi="http://schemas.microsoft.com/office/word/2010/wordprocessingInk" xmlns:wps="http://schemas.microsoft.com/office/word/2010/wordprocessingShape" mc:Ignorable="w14 wp14">
+  <w:p>
+    <w:pPr>
+      <w:pStyle w:val="Footer"/>
+    </w:pPr>
+    <w:r>
+      <w:rPr>
+        <w:sz w:val="14"/>
+      </w:rPr>
+      <w:t>학력·경력·자격·출강 이력은 본인이 작성하고 확인한 뒤 제출합니다. 기관 지정 서식이 있으면 해당 서식에 맞춰 옮겨 작성합니다.</w:t>
+      <w:br/>
+      <w:t>수업 내용은 출강 제안이며 일정·장소·비용과 운영 조건은 협의 후 확정합니다.</w:t>
+    </w:r>
+  </w:p>
+</w:ftr>
 </file>
 
 <file path=word/numbering.xml><?xml version="1.0" encoding="utf-8"?>

</xml_diff>

<commit_message>
fix: replace lecture documents with A4 editorial v5
</commit_message>
<xml_diff>
--- a/public/dontstop-lecture/profile-friendly.docx
+++ b/public/dontstop-lecture/profile-friendly.docx
@@ -3,226 +3,109 @@
 <w:document xmlns:wpc="http://schemas.microsoft.com/office/word/2010/wordprocessingCanvas" xmlns:mo="http://schemas.microsoft.com/office/mac/office/2008/main" xmlns:mc="http://schemas.openxmlformats.org/markup-compatibility/2006" xmlns:mv="urn:schemas-microsoft-com:mac:vml" xmlns:o="urn:schemas-microsoft-com:office:office" xmlns:r="http://schemas.openxmlformats.org/officeDocument/2006/relationships" xmlns:m="http://schemas.openxmlformats.org/officeDocument/2006/math" xmlns:v="urn:schemas-microsoft-com:vml" xmlns:wp14="http://schemas.microsoft.com/office/word/2010/wordprocessingDrawing" xmlns:wp="http://schemas.openxmlformats.org/drawingml/2006/wordprocessingDrawing" xmlns:w10="urn:schemas-microsoft-com:office:word" xmlns:w="http://schemas.openxmlformats.org/wordprocessingml/2006/main" xmlns:w14="http://schemas.microsoft.com/office/word/2010/wordml" xmlns:wpg="http://schemas.microsoft.com/office/word/2010/wordprocessingGroup" xmlns:wpi="http://schemas.microsoft.com/office/word/2010/wordprocessingInk" xmlns:wne="http://schemas.microsoft.com/office/word/2006/wordml" xmlns:wps="http://schemas.microsoft.com/office/word/2010/wordprocessingShape" mc:Ignorable="w14 wp14">
   <w:body>
     <w:p>
-      <w:pPr>
-        <w:jc w:val="center"/>
-      </w:pPr>
       <w:r>
-        <w:rPr>
-          <w:b/>
-          <w:sz w:val="44"/>
-        </w:rPr>
-        <w:t>강사 이력 요약서</w:t>
+        <w:t>DON’T STOP ENGLISH</w:t>
       </w:r>
     </w:p>
     <w:p>
       <w:pPr>
-        <w:jc w:val="center"/>
+        <w:pStyle w:val="Title"/>
       </w:pPr>
       <w:r>
-        <w:t>기관 검토용 · 1쪽 요약 양식</w:t>
+        <w:t>박새미 · 강사 프로필</w:t>
       </w:r>
     </w:p>
     <w:tbl>
       <w:tblPr>
         <w:tblStyle w:val="TableGrid"/>
         <w:tblW w:type="auto" w:w="0"/>
-        <w:tblLayout w:type="fixed"/>
         <w:tblLook w:firstColumn="1" w:firstRow="1" w:lastColumn="0" w:lastRow="0" w:noHBand="0" w:noVBand="1" w:val="04A0"/>
       </w:tblPr>
       <w:tblGrid>
-        <w:gridCol w:w="1417"/>
-        <w:gridCol w:w="6860"/>
-        <w:gridCol w:w="1701"/>
+        <w:gridCol w:w="4989"/>
+        <w:gridCol w:w="4989"/>
       </w:tblGrid>
       <w:tr>
-        <w:trPr>
-          <w:trHeight w:val="454"/>
-        </w:trPr>
         <w:tc>
           <w:tcPr>
-            <w:tcW w:type="dxa" w:w="1417"/>
-            <w:shd w:fill="F0F3F6"/>
+            <w:tcW w:type="dxa" w:w="4989"/>
           </w:tcPr>
           <w:p>
             <w:r>
-              <w:t>성명</w:t>
-            </w:r>
-          </w:p>
-        </w:tc>
-        <w:tc>
-          <w:tcPr>
-            <w:tcW w:type="dxa" w:w="5726"/>
-          </w:tcPr>
-          <w:p>
-            <w:r>
-              <w:t>박새미</w:t>
+              <w:t>돈스탑 잉글리시 운영자</w:t>
+              <w:br/>
+              <w:t>활동 지역: 부천</w:t>
+              <w:br/>
+              <w:t>제안 대상: 중장년·어르신</w:t>
+              <w:br/>
+              <w:t>수업 시간: 60·90·120분</w:t>
             </w:r>
           </w:p>
         </w:tc>
         <w:tc>
           <w:tcPr>
             <w:tcW w:type="dxa" w:w="1701"/>
-            <w:vMerge w:val="restart"/>
-            <w:vAlign w:val="center"/>
           </w:tcPr>
           <w:p>
-            <w:pPr>
-              <w:jc w:val="center"/>
-            </w:pPr>
             <w:r>
-              <w:t>사진 부착</w:t>
+              <w:t>프로필 사진</w:t>
               <w:br/>
               <w:t>3 × 4 cm</w:t>
             </w:r>
           </w:p>
         </w:tc>
       </w:tr>
-      <w:tr>
-        <w:trPr>
-          <w:trHeight w:val="454"/>
-        </w:trPr>
-        <w:tc>
-          <w:tcPr>
-            <w:tcW w:type="dxa" w:w="1417"/>
-            <w:shd w:fill="F0F3F6"/>
-          </w:tcPr>
-          <w:p>
-            <w:r>
-              <w:t>소속 / 직위</w:t>
-            </w:r>
-          </w:p>
-        </w:tc>
-        <w:tc>
-          <w:tcPr>
-            <w:tcW w:type="dxa" w:w="5726"/>
-          </w:tcPr>
-          <w:p>
-            <w:r>
-              <w:t>돈스탑 잉글리시 / 운영자</w:t>
-            </w:r>
-          </w:p>
-        </w:tc>
-        <w:tc>
-          <w:tcPr>
-            <w:tcW w:type="dxa" w:w="1701"/>
-            <w:vMerge/>
-          </w:tcPr>
-          <w:p/>
-        </w:tc>
-      </w:tr>
-      <w:tr>
-        <w:trPr>
-          <w:trHeight w:val="454"/>
-        </w:trPr>
-        <w:tc>
-          <w:tcPr>
-            <w:tcW w:type="dxa" w:w="1417"/>
-            <w:shd w:fill="F0F3F6"/>
-          </w:tcPr>
-          <w:p>
-            <w:r>
-              <w:t>연락처</w:t>
-            </w:r>
-          </w:p>
-        </w:tc>
-        <w:tc>
-          <w:tcPr>
-            <w:tcW w:type="dxa" w:w="5726"/>
-          </w:tcPr>
-          <w:p>
-            <w:r/>
-          </w:p>
-        </w:tc>
-        <w:tc>
-          <w:tcPr>
-            <w:tcW w:type="dxa" w:w="1701"/>
-            <w:vMerge/>
-          </w:tcPr>
-          <w:p/>
-        </w:tc>
-      </w:tr>
-      <w:tr>
-        <w:trPr>
-          <w:trHeight w:val="454"/>
-        </w:trPr>
-        <w:tc>
-          <w:tcPr>
-            <w:tcW w:type="dxa" w:w="1417"/>
-            <w:shd w:fill="F0F3F6"/>
-          </w:tcPr>
-          <w:p>
-            <w:r>
-              <w:t>전자우편</w:t>
-            </w:r>
-          </w:p>
-        </w:tc>
-        <w:tc>
-          <w:tcPr>
-            <w:tcW w:type="dxa" w:w="5726"/>
-          </w:tcPr>
-          <w:p>
-            <w:r/>
-          </w:p>
-        </w:tc>
-        <w:tc>
-          <w:tcPr>
-            <w:tcW w:type="dxa" w:w="1701"/>
-            <w:vMerge/>
-          </w:tcPr>
-          <w:p/>
-        </w:tc>
-      </w:tr>
-      <w:tr>
-        <w:trPr>
-          <w:trHeight w:val="454"/>
-        </w:trPr>
-        <w:tc>
-          <w:tcPr>
-            <w:tcW w:type="dxa" w:w="1417"/>
-            <w:shd w:fill="F0F3F6"/>
-          </w:tcPr>
-          <w:p>
-            <w:r>
-              <w:t>활동 지역</w:t>
-            </w:r>
-          </w:p>
-        </w:tc>
-        <w:tc>
-          <w:tcPr>
-            <w:tcW w:type="dxa" w:w="5726"/>
-          </w:tcPr>
-          <w:p>
-            <w:r>
-              <w:t>부천</w:t>
-            </w:r>
-          </w:p>
-        </w:tc>
-        <w:tc>
-          <w:tcPr>
-            <w:tcW w:type="dxa" w:w="1701"/>
-            <w:vMerge/>
-          </w:tcPr>
-          <w:p/>
-        </w:tc>
-      </w:tr>
     </w:tbl>
     <w:p>
       <w:pPr>
-        <w:spacing w:before="180" w:after="100"/>
+        <w:pStyle w:val="Heading1"/>
       </w:pPr>
       <w:r>
-        <w:rPr>
-          <w:b/>
-          <w:sz w:val="22"/>
-        </w:rPr>
-        <w:t>1. 학력 사항</w:t>
+        <w:t>생활과 여행에서 쓸 장면을 고릅니다</w:t>
+      </w:r>
+    </w:p>
+    <w:p>
+      <w:r>
+        <w:t>생활·여행 영어: 주문하기, 길 묻기, 인사와 소개. 짧은 표현을 듣고 읽은 뒤 선택한 장면에서 말해보는 구성입니다.</w:t>
+      </w:r>
+    </w:p>
+    <w:p>
+      <w:r>
+        <w:t>기관 단체 특강: 10명 이상, 한 주제 중심의 1~2시간 수업. 기관의 공간과 참여 지원 여건에 맞춰 조율합니다.</w:t>
+      </w:r>
+    </w:p>
+    <w:p>
+      <w:r>
+        <w:t>소규모 영어 모임: 2~3인. 배우고 싶은 장면과 참여자의 속도를 함께 정합니다.</w:t>
+      </w:r>
+    </w:p>
+    <w:p>
+      <w:r>
+        <w:t>출강 문의: https://pf.kakao.com/_cDxaKn/chat</w:t>
+        <w:br/>
+        <w:t>일정·장소·강사료·교재와 운영 조건은 상담 후 확정합니다.</w:t>
+      </w:r>
+    </w:p>
+    <w:p>
+      <w:pPr>
+        <w:pStyle w:val="Heading1"/>
+      </w:pPr>
+      <w:r>
+        <w:t>강사 이력 사항</w:t>
+      </w:r>
+    </w:p>
+    <w:p>
+      <w:pPr>
+        <w:pStyle w:val="Heading2"/>
+      </w:pPr>
+      <w:r>
+        <w:t>주요 이력</w:t>
       </w:r>
     </w:p>
     <w:tbl>
       <w:tblPr>
         <w:tblStyle w:val="TableGrid"/>
         <w:tblW w:type="auto" w:w="0"/>
-        <w:jc w:val="center"/>
         <w:tblLook w:firstColumn="1" w:firstRow="1" w:lastColumn="0" w:lastRow="0" w:noHBand="0" w:noVBand="1" w:val="04A0"/>
       </w:tblPr>
       <w:tblGrid>
@@ -234,33 +117,30 @@
         <w:tc>
           <w:tcPr>
             <w:tcW w:type="dxa" w:w="3326"/>
-            <w:shd w:fill="F0F3F6"/>
           </w:tcPr>
           <w:p>
             <w:r>
-              <w:t>기간</w:t>
+              <w:t>학력 / 전공</w:t>
             </w:r>
           </w:p>
         </w:tc>
         <w:tc>
           <w:tcPr>
             <w:tcW w:type="dxa" w:w="3326"/>
-            <w:shd w:fill="F0F3F6"/>
           </w:tcPr>
           <w:p>
             <w:r>
-              <w:t>학교 / 전공</w:t>
+              <w:t>주요 경력</w:t>
             </w:r>
           </w:p>
         </w:tc>
         <w:tc>
           <w:tcPr>
             <w:tcW w:type="dxa" w:w="3326"/>
-            <w:shd w:fill="F0F3F6"/>
           </w:tcPr>
           <w:p>
             <w:r>
-              <w:t>학위 / 졸업 구분</w:t>
+              <w:t>자격 / 출강 이력</w:t>
             </w:r>
           </w:p>
         </w:tc>
@@ -269,634 +149,34 @@
         <w:tc>
           <w:tcPr>
             <w:tcW w:type="dxa" w:w="3326"/>
-            <w:vAlign w:val="center"/>
           </w:tcPr>
-          <w:p>
-            <w:pPr>
-              <w:spacing w:after="60" w:before="60"/>
-            </w:pPr>
-            <w:r/>
-          </w:p>
+          <w:p/>
         </w:tc>
         <w:tc>
           <w:tcPr>
             <w:tcW w:type="dxa" w:w="3326"/>
-            <w:vAlign w:val="center"/>
           </w:tcPr>
-          <w:p>
-            <w:pPr>
-              <w:spacing w:after="60" w:before="60"/>
-            </w:pPr>
-            <w:r/>
-          </w:p>
+          <w:p/>
         </w:tc>
         <w:tc>
           <w:tcPr>
             <w:tcW w:type="dxa" w:w="3326"/>
-            <w:vAlign w:val="center"/>
           </w:tcPr>
-          <w:p>
-            <w:pPr>
-              <w:spacing w:after="60" w:before="60"/>
-            </w:pPr>
-            <w:r/>
-          </w:p>
-        </w:tc>
-      </w:tr>
-      <w:tr>
-        <w:tc>
-          <w:tcPr>
-            <w:tcW w:type="dxa" w:w="3326"/>
-            <w:vAlign w:val="center"/>
-          </w:tcPr>
-          <w:p>
-            <w:pPr>
-              <w:spacing w:after="60" w:before="60"/>
-            </w:pPr>
-            <w:r/>
-          </w:p>
-        </w:tc>
-        <w:tc>
-          <w:tcPr>
-            <w:tcW w:type="dxa" w:w="3326"/>
-            <w:vAlign w:val="center"/>
-          </w:tcPr>
-          <w:p>
-            <w:pPr>
-              <w:spacing w:after="60" w:before="60"/>
-            </w:pPr>
-            <w:r/>
-          </w:p>
-        </w:tc>
-        <w:tc>
-          <w:tcPr>
-            <w:tcW w:type="dxa" w:w="3326"/>
-            <w:vAlign w:val="center"/>
-          </w:tcPr>
-          <w:p>
-            <w:pPr>
-              <w:spacing w:after="60" w:before="60"/>
-            </w:pPr>
-            <w:r/>
-          </w:p>
-        </w:tc>
-      </w:tr>
-    </w:tbl>
-    <w:p>
-      <w:pPr>
-        <w:spacing w:before="180" w:after="100"/>
-      </w:pPr>
-      <w:r>
-        <w:rPr>
-          <w:b/>
-          <w:sz w:val="22"/>
-        </w:rPr>
-        <w:t>2. 주요 경력</w:t>
-      </w:r>
-    </w:p>
-    <w:tbl>
-      <w:tblPr>
-        <w:tblStyle w:val="TableGrid"/>
-        <w:tblW w:type="auto" w:w="0"/>
-        <w:jc w:val="center"/>
-        <w:tblLook w:firstColumn="1" w:firstRow="1" w:lastColumn="0" w:lastRow="0" w:noHBand="0" w:noVBand="1" w:val="04A0"/>
-      </w:tblPr>
-      <w:tblGrid>
-        <w:gridCol w:w="3326"/>
-        <w:gridCol w:w="3326"/>
-        <w:gridCol w:w="3326"/>
-      </w:tblGrid>
-      <w:tr>
-        <w:tc>
-          <w:tcPr>
-            <w:tcW w:type="dxa" w:w="3326"/>
-            <w:shd w:fill="F0F3F6"/>
-          </w:tcPr>
-          <w:p>
-            <w:r>
-              <w:t>기간</w:t>
-            </w:r>
-          </w:p>
-        </w:tc>
-        <w:tc>
-          <w:tcPr>
-            <w:tcW w:type="dxa" w:w="3326"/>
-            <w:shd w:fill="F0F3F6"/>
-          </w:tcPr>
-          <w:p>
-            <w:r>
-              <w:t>기관 / 소속</w:t>
-            </w:r>
-          </w:p>
-        </w:tc>
-        <w:tc>
-          <w:tcPr>
-            <w:tcW w:type="dxa" w:w="3326"/>
-            <w:shd w:fill="F0F3F6"/>
-          </w:tcPr>
-          <w:p>
-            <w:r>
-              <w:t>직위 및 담당 업무</w:t>
-            </w:r>
-          </w:p>
-        </w:tc>
-      </w:tr>
-      <w:tr>
-        <w:tc>
-          <w:tcPr>
-            <w:tcW w:type="dxa" w:w="3326"/>
-            <w:vAlign w:val="center"/>
-          </w:tcPr>
-          <w:p>
-            <w:pPr>
-              <w:spacing w:after="60" w:before="60"/>
-            </w:pPr>
-            <w:r/>
-          </w:p>
-        </w:tc>
-        <w:tc>
-          <w:tcPr>
-            <w:tcW w:type="dxa" w:w="3326"/>
-            <w:vAlign w:val="center"/>
-          </w:tcPr>
-          <w:p>
-            <w:pPr>
-              <w:spacing w:after="60" w:before="60"/>
-            </w:pPr>
-            <w:r/>
-          </w:p>
-        </w:tc>
-        <w:tc>
-          <w:tcPr>
-            <w:tcW w:type="dxa" w:w="3326"/>
-            <w:vAlign w:val="center"/>
-          </w:tcPr>
-          <w:p>
-            <w:pPr>
-              <w:spacing w:after="60" w:before="60"/>
-            </w:pPr>
-            <w:r/>
-          </w:p>
-        </w:tc>
-      </w:tr>
-      <w:tr>
-        <w:tc>
-          <w:tcPr>
-            <w:tcW w:type="dxa" w:w="3326"/>
-            <w:vAlign w:val="center"/>
-          </w:tcPr>
-          <w:p>
-            <w:pPr>
-              <w:spacing w:after="60" w:before="60"/>
-            </w:pPr>
-            <w:r/>
-          </w:p>
-        </w:tc>
-        <w:tc>
-          <w:tcPr>
-            <w:tcW w:type="dxa" w:w="3326"/>
-            <w:vAlign w:val="center"/>
-          </w:tcPr>
-          <w:p>
-            <w:pPr>
-              <w:spacing w:after="60" w:before="60"/>
-            </w:pPr>
-            <w:r/>
-          </w:p>
-        </w:tc>
-        <w:tc>
-          <w:tcPr>
-            <w:tcW w:type="dxa" w:w="3326"/>
-            <w:vAlign w:val="center"/>
-          </w:tcPr>
-          <w:p>
-            <w:pPr>
-              <w:spacing w:after="60" w:before="60"/>
-            </w:pPr>
-            <w:r/>
-          </w:p>
-        </w:tc>
-      </w:tr>
-    </w:tbl>
-    <w:p>
-      <w:pPr>
-        <w:spacing w:before="180" w:after="100"/>
-      </w:pPr>
-      <w:r>
-        <w:rPr>
-          <w:b/>
-          <w:sz w:val="22"/>
-        </w:rPr>
-        <w:t>3. 자격 및 수료</w:t>
-      </w:r>
-    </w:p>
-    <w:tbl>
-      <w:tblPr>
-        <w:tblStyle w:val="TableGrid"/>
-        <w:tblW w:type="auto" w:w="0"/>
-        <w:jc w:val="center"/>
-        <w:tblLook w:firstColumn="1" w:firstRow="1" w:lastColumn="0" w:lastRow="0" w:noHBand="0" w:noVBand="1" w:val="04A0"/>
-      </w:tblPr>
-      <w:tblGrid>
-        <w:gridCol w:w="3326"/>
-        <w:gridCol w:w="3326"/>
-        <w:gridCol w:w="3326"/>
-      </w:tblGrid>
-      <w:tr>
-        <w:tc>
-          <w:tcPr>
-            <w:tcW w:type="dxa" w:w="3326"/>
-            <w:shd w:fill="F0F3F6"/>
-          </w:tcPr>
-          <w:p>
-            <w:r>
-              <w:t>취득 / 수료일</w:t>
-            </w:r>
-          </w:p>
-        </w:tc>
-        <w:tc>
-          <w:tcPr>
-            <w:tcW w:type="dxa" w:w="3326"/>
-            <w:shd w:fill="F0F3F6"/>
-          </w:tcPr>
-          <w:p>
-            <w:r>
-              <w:t>자격·과정명</w:t>
-            </w:r>
-          </w:p>
-        </w:tc>
-        <w:tc>
-          <w:tcPr>
-            <w:tcW w:type="dxa" w:w="3326"/>
-            <w:shd w:fill="F0F3F6"/>
-          </w:tcPr>
-          <w:p>
-            <w:r>
-              <w:t>발급 / 교육 기관</w:t>
-            </w:r>
-          </w:p>
-        </w:tc>
-      </w:tr>
-      <w:tr>
-        <w:tc>
-          <w:tcPr>
-            <w:tcW w:type="dxa" w:w="3326"/>
-            <w:vAlign w:val="center"/>
-          </w:tcPr>
-          <w:p>
-            <w:pPr>
-              <w:spacing w:after="60" w:before="60"/>
-            </w:pPr>
-            <w:r/>
-          </w:p>
-        </w:tc>
-        <w:tc>
-          <w:tcPr>
-            <w:tcW w:type="dxa" w:w="3326"/>
-            <w:vAlign w:val="center"/>
-          </w:tcPr>
-          <w:p>
-            <w:pPr>
-              <w:spacing w:after="60" w:before="60"/>
-            </w:pPr>
-            <w:r/>
-          </w:p>
-        </w:tc>
-        <w:tc>
-          <w:tcPr>
-            <w:tcW w:type="dxa" w:w="3326"/>
-            <w:vAlign w:val="center"/>
-          </w:tcPr>
-          <w:p>
-            <w:pPr>
-              <w:spacing w:after="60" w:before="60"/>
-            </w:pPr>
-            <w:r/>
-          </w:p>
-        </w:tc>
-      </w:tr>
-      <w:tr>
-        <w:tc>
-          <w:tcPr>
-            <w:tcW w:type="dxa" w:w="3326"/>
-            <w:vAlign w:val="center"/>
-          </w:tcPr>
-          <w:p>
-            <w:pPr>
-              <w:spacing w:after="60" w:before="60"/>
-            </w:pPr>
-            <w:r/>
-          </w:p>
-        </w:tc>
-        <w:tc>
-          <w:tcPr>
-            <w:tcW w:type="dxa" w:w="3326"/>
-            <w:vAlign w:val="center"/>
-          </w:tcPr>
-          <w:p>
-            <w:pPr>
-              <w:spacing w:after="60" w:before="60"/>
-            </w:pPr>
-            <w:r/>
-          </w:p>
-        </w:tc>
-        <w:tc>
-          <w:tcPr>
-            <w:tcW w:type="dxa" w:w="3326"/>
-            <w:vAlign w:val="center"/>
-          </w:tcPr>
-          <w:p>
-            <w:pPr>
-              <w:spacing w:after="60" w:before="60"/>
-            </w:pPr>
-            <w:r/>
-          </w:p>
-        </w:tc>
-      </w:tr>
-    </w:tbl>
-    <w:p>
-      <w:pPr>
-        <w:spacing w:before="180" w:after="100"/>
-      </w:pPr>
-      <w:r>
-        <w:rPr>
-          <w:b/>
-          <w:sz w:val="22"/>
-        </w:rPr>
-        <w:t>4. 강의 및 출강 이력</w:t>
-      </w:r>
-    </w:p>
-    <w:tbl>
-      <w:tblPr>
-        <w:tblStyle w:val="TableGrid"/>
-        <w:tblW w:type="auto" w:w="0"/>
-        <w:jc w:val="center"/>
-        <w:tblLook w:firstColumn="1" w:firstRow="1" w:lastColumn="0" w:lastRow="0" w:noHBand="0" w:noVBand="1" w:val="04A0"/>
-      </w:tblPr>
-      <w:tblGrid>
-        <w:gridCol w:w="3326"/>
-        <w:gridCol w:w="3326"/>
-        <w:gridCol w:w="3326"/>
-      </w:tblGrid>
-      <w:tr>
-        <w:tc>
-          <w:tcPr>
-            <w:tcW w:type="dxa" w:w="3326"/>
-            <w:shd w:fill="F0F3F6"/>
-          </w:tcPr>
-          <w:p>
-            <w:r>
-              <w:t>일자 / 기간</w:t>
-            </w:r>
-          </w:p>
-        </w:tc>
-        <w:tc>
-          <w:tcPr>
-            <w:tcW w:type="dxa" w:w="3326"/>
-            <w:shd w:fill="F0F3F6"/>
-          </w:tcPr>
-          <w:p>
-            <w:r>
-              <w:t>기관 / 대상</w:t>
-            </w:r>
-          </w:p>
-        </w:tc>
-        <w:tc>
-          <w:tcPr>
-            <w:tcW w:type="dxa" w:w="3326"/>
-            <w:shd w:fill="F0F3F6"/>
-          </w:tcPr>
-          <w:p>
-            <w:r>
-              <w:t>주제 및 시간</w:t>
-            </w:r>
-          </w:p>
-        </w:tc>
-      </w:tr>
-      <w:tr>
-        <w:tc>
-          <w:tcPr>
-            <w:tcW w:type="dxa" w:w="3326"/>
-            <w:vAlign w:val="center"/>
-          </w:tcPr>
-          <w:p>
-            <w:pPr>
-              <w:spacing w:after="60" w:before="60"/>
-            </w:pPr>
-            <w:r/>
-          </w:p>
-        </w:tc>
-        <w:tc>
-          <w:tcPr>
-            <w:tcW w:type="dxa" w:w="3326"/>
-            <w:vAlign w:val="center"/>
-          </w:tcPr>
-          <w:p>
-            <w:pPr>
-              <w:spacing w:after="60" w:before="60"/>
-            </w:pPr>
-            <w:r/>
-          </w:p>
-        </w:tc>
-        <w:tc>
-          <w:tcPr>
-            <w:tcW w:type="dxa" w:w="3326"/>
-            <w:vAlign w:val="center"/>
-          </w:tcPr>
-          <w:p>
-            <w:pPr>
-              <w:spacing w:after="60" w:before="60"/>
-            </w:pPr>
-            <w:r/>
-          </w:p>
-        </w:tc>
-      </w:tr>
-      <w:tr>
-        <w:tc>
-          <w:tcPr>
-            <w:tcW w:type="dxa" w:w="3326"/>
-            <w:vAlign w:val="center"/>
-          </w:tcPr>
-          <w:p>
-            <w:pPr>
-              <w:spacing w:after="60" w:before="60"/>
-            </w:pPr>
-            <w:r/>
-          </w:p>
-        </w:tc>
-        <w:tc>
-          <w:tcPr>
-            <w:tcW w:type="dxa" w:w="3326"/>
-            <w:vAlign w:val="center"/>
-          </w:tcPr>
-          <w:p>
-            <w:pPr>
-              <w:spacing w:after="60" w:before="60"/>
-            </w:pPr>
-            <w:r/>
-          </w:p>
-        </w:tc>
-        <w:tc>
-          <w:tcPr>
-            <w:tcW w:type="dxa" w:w="3326"/>
-            <w:vAlign w:val="center"/>
-          </w:tcPr>
-          <w:p>
-            <w:pPr>
-              <w:spacing w:after="60" w:before="60"/>
-            </w:pPr>
-            <w:r/>
-          </w:p>
-        </w:tc>
-      </w:tr>
-    </w:tbl>
-    <w:p>
-      <w:pPr>
-        <w:spacing w:before="180" w:after="100"/>
-      </w:pPr>
-      <w:r>
-        <w:rPr>
-          <w:b/>
-          <w:sz w:val="22"/>
-        </w:rPr>
-        <w:t>5. 강의 분야 및 운영 제안</w:t>
-      </w:r>
-    </w:p>
-    <w:tbl>
-      <w:tblPr>
-        <w:tblStyle w:val="TableGrid"/>
-        <w:tblW w:type="auto" w:w="0"/>
-        <w:jc w:val="center"/>
-        <w:tblLook w:firstColumn="1" w:firstRow="1" w:lastColumn="0" w:lastRow="0" w:noHBand="0" w:noVBand="1" w:val="04A0"/>
-      </w:tblPr>
-      <w:tblGrid>
-        <w:gridCol w:w="4989"/>
-        <w:gridCol w:w="4989"/>
-      </w:tblGrid>
-      <w:tr>
-        <w:tc>
-          <w:tcPr>
-            <w:tcW w:type="dxa" w:w="4989"/>
-            <w:shd w:fill="F0F3F6"/>
-          </w:tcPr>
-          <w:p>
-            <w:r>
-              <w:t>구분</w:t>
-            </w:r>
-          </w:p>
-        </w:tc>
-        <w:tc>
-          <w:tcPr>
-            <w:tcW w:type="dxa" w:w="4989"/>
-            <w:shd w:fill="F0F3F6"/>
-          </w:tcPr>
-          <w:p>
-            <w:r>
-              <w:t>내용</w:t>
-            </w:r>
-          </w:p>
-        </w:tc>
-      </w:tr>
-      <w:tr>
-        <w:tc>
-          <w:tcPr>
-            <w:tcW w:type="dxa" w:w="4989"/>
-            <w:vAlign w:val="center"/>
-          </w:tcPr>
-          <w:p>
-            <w:pPr>
-              <w:spacing w:after="60" w:before="60"/>
-            </w:pPr>
-            <w:r>
-              <w:t>강의 분야</w:t>
-            </w:r>
-          </w:p>
-        </w:tc>
-        <w:tc>
-          <w:tcPr>
-            <w:tcW w:type="dxa" w:w="4989"/>
-            <w:vAlign w:val="center"/>
-          </w:tcPr>
-          <w:p>
-            <w:pPr>
-              <w:spacing w:after="60" w:before="60"/>
-            </w:pPr>
-            <w:r>
-              <w:t>생활·여행 영어</w:t>
-            </w:r>
-          </w:p>
-        </w:tc>
-      </w:tr>
-      <w:tr>
-        <w:tc>
-          <w:tcPr>
-            <w:tcW w:type="dxa" w:w="4989"/>
-            <w:vAlign w:val="center"/>
-          </w:tcPr>
-          <w:p>
-            <w:pPr>
-              <w:spacing w:after="60" w:before="60"/>
-            </w:pPr>
-            <w:r>
-              <w:t>대상 / 형태</w:t>
-            </w:r>
-          </w:p>
-        </w:tc>
-        <w:tc>
-          <w:tcPr>
-            <w:tcW w:type="dxa" w:w="4989"/>
-            <w:vAlign w:val="center"/>
-          </w:tcPr>
-          <w:p>
-            <w:pPr>
-              <w:spacing w:after="60" w:before="60"/>
-            </w:pPr>
-            <w:r>
-              <w:t>중장년·어르신 / 2~3인 모임 또는 10명 이상 단체</w:t>
-            </w:r>
-          </w:p>
-        </w:tc>
-      </w:tr>
-      <w:tr>
-        <w:tc>
-          <w:tcPr>
-            <w:tcW w:type="dxa" w:w="4989"/>
-            <w:vAlign w:val="center"/>
-          </w:tcPr>
-          <w:p>
-            <w:pPr>
-              <w:spacing w:after="60" w:before="60"/>
-            </w:pPr>
-            <w:r>
-              <w:t>시간 / 지역</w:t>
-            </w:r>
-          </w:p>
-        </w:tc>
-        <w:tc>
-          <w:tcPr>
-            <w:tcW w:type="dxa" w:w="4989"/>
-            <w:vAlign w:val="center"/>
-          </w:tcPr>
-          <w:p>
-            <w:pPr>
-              <w:spacing w:after="60" w:before="60"/>
-            </w:pPr>
-            <w:r>
-              <w:t>60~120분 / 부천 중심 · 세부 조건 협의</w:t>
-            </w:r>
-          </w:p>
+          <w:p/>
         </w:tc>
       </w:tr>
     </w:tbl>
     <w:p>
       <w:r>
-        <w:t>작성일:                    작성자: 박새미</w:t>
+        <w:t>개인 연락처:　　　　　　　　　전자우편:</w:t>
+        <w:br/>
+        <w:t>작성일:　　　　　　　　　　　작성자: 박새미</w:t>
       </w:r>
     </w:p>
     <w:sectPr>
       <w:footerReference w:type="default" r:id="rId9"/>
       <w:pgSz w:w="11906" w:h="16838"/>
-      <w:pgMar w:top="850" w:right="964" w:bottom="850" w:left="964" w:header="720" w:footer="720" w:gutter="0"/>
+      <w:pgMar w:top="964" w:right="964" w:bottom="964" w:left="964" w:header="720" w:footer="720" w:gutter="0"/>
       <w:cols w:space="720"/>
       <w:docGrid w:linePitch="360"/>
     </w:sectPr>
@@ -911,12 +191,7 @@
       <w:pStyle w:val="Footer"/>
     </w:pPr>
     <w:r>
-      <w:rPr>
-        <w:sz w:val="14"/>
-      </w:rPr>
-      <w:t>학력·경력·자격·출강 이력은 본인이 작성하고 확인한 뒤 제출합니다. 기관 지정 서식이 있으면 해당 서식에 맞춰 옮겨 작성합니다.</w:t>
-      <w:br/>
-      <w:t>수업 내용은 출강 제안이며 일정·장소·비용과 운영 조건은 협의 후 확정합니다.</w:t>
+      <w:t>본인의 실제 이력과 증빙을 확인해 작성합니다. 기관 지정 서식을 우선 사용합니다.</w:t>
     </w:r>
   </w:p>
 </w:ftr>
@@ -1285,12 +560,10 @@
     <w:name w:val="Normal"/>
     <w:qFormat/>
     <w:rsid w:val="00FC693F"/>
-    <w:pPr>
-      <w:spacing w:after="60"/>
-    </w:pPr>
     <w:rPr>
       <w:rFonts w:ascii="Malgun Gothic" w:hAnsi="Malgun Gothic" w:eastAsia="Malgun Gothic"/>
-      <w:sz w:val="18"/>
+      <w:color w:val="173647"/>
+      <w:sz w:val="20"/>
     </w:rPr>
   </w:style>
   <w:style w:type="paragraph" w:styleId="Header">
@@ -1307,10 +580,6 @@
       </w:tabs>
       <w:spacing w:after="0" w:line="240" w:lineRule="auto"/>
     </w:pPr>
-    <w:rPr>
-      <w:rFonts w:ascii="Malgun Gothic" w:hAnsi="Malgun Gothic" w:eastAsia="Malgun Gothic"/>
-      <w:sz w:val="18"/>
-    </w:rPr>
   </w:style>
   <w:style w:type="character" w:customStyle="1" w:styleId="HeaderChar">
     <w:name w:val="Header Char"/>
@@ -1318,10 +587,6 @@
     <w:link w:val="Header"/>
     <w:uiPriority w:val="99"/>
     <w:rsid w:val="00E618BF"/>
-    <w:rPr>
-      <w:rFonts w:ascii="Malgun Gothic" w:hAnsi="Malgun Gothic" w:eastAsia="Malgun Gothic"/>
-      <w:sz w:val="18"/>
-    </w:rPr>
   </w:style>
   <w:style w:type="paragraph" w:styleId="Footer">
     <w:name w:val="footer"/>
@@ -1337,10 +602,6 @@
       </w:tabs>
       <w:spacing w:after="0" w:line="240" w:lineRule="auto"/>
     </w:pPr>
-    <w:rPr>
-      <w:rFonts w:ascii="Malgun Gothic" w:hAnsi="Malgun Gothic" w:eastAsia="Malgun Gothic"/>
-      <w:sz w:val="18"/>
-    </w:rPr>
   </w:style>
   <w:style w:type="character" w:customStyle="1" w:styleId="FooterChar">
     <w:name w:val="Footer Char"/>
@@ -1348,10 +609,6 @@
     <w:link w:val="Footer"/>
     <w:uiPriority w:val="99"/>
     <w:rsid w:val="00E618BF"/>
-    <w:rPr>
-      <w:rFonts w:ascii="Malgun Gothic" w:hAnsi="Malgun Gothic" w:eastAsia="Malgun Gothic"/>
-      <w:sz w:val="18"/>
-    </w:rPr>
   </w:style>
   <w:style w:type="paragraph" w:styleId="Heading1">
     <w:name w:val="heading 1"/>
@@ -1371,8 +628,8 @@
       <w:rFonts w:asciiTheme="majorHAnsi" w:eastAsiaTheme="majorEastAsia" w:hAnsiTheme="majorHAnsi" w:cstheme="majorBidi" w:ascii="Malgun Gothic" w:hAnsi="Malgun Gothic" w:eastAsia="Malgun Gothic"/>
       <w:b/>
       <w:bCs/>
-      <w:color w:val="365F91" w:themeColor="accent1" w:themeShade="BF"/>
-      <w:sz w:val="18"/>
+      <w:color w:val="173647"/>
+      <w:sz w:val="32"/>
       <w:szCs w:val="28"/>
     </w:rPr>
   </w:style>
@@ -1395,8 +652,8 @@
       <w:rFonts w:asciiTheme="majorHAnsi" w:eastAsiaTheme="majorEastAsia" w:hAnsiTheme="majorHAnsi" w:cstheme="majorBidi" w:ascii="Malgun Gothic" w:hAnsi="Malgun Gothic" w:eastAsia="Malgun Gothic"/>
       <w:b/>
       <w:bCs/>
-      <w:color w:val="4F81BD" w:themeColor="accent1"/>
-      <w:sz w:val="18"/>
+      <w:color w:val="173647"/>
+      <w:sz w:val="32"/>
       <w:szCs w:val="26"/>
     </w:rPr>
   </w:style>
@@ -1416,11 +673,10 @@
       <w:outlineLvl w:val="2"/>
     </w:pPr>
     <w:rPr>
-      <w:rFonts w:asciiTheme="majorHAnsi" w:eastAsiaTheme="majorEastAsia" w:hAnsiTheme="majorHAnsi" w:cstheme="majorBidi" w:ascii="Malgun Gothic" w:hAnsi="Malgun Gothic" w:eastAsia="Malgun Gothic"/>
+      <w:rFonts w:asciiTheme="majorHAnsi" w:eastAsiaTheme="majorEastAsia" w:hAnsiTheme="majorHAnsi" w:cstheme="majorBidi"/>
       <w:b/>
       <w:bCs/>
       <w:color w:val="4F81BD" w:themeColor="accent1"/>
-      <w:sz w:val="18"/>
     </w:rPr>
   </w:style>
   <w:style w:type="paragraph" w:styleId="Heading4">
@@ -1440,13 +696,12 @@
       <w:outlineLvl w:val="3"/>
     </w:pPr>
     <w:rPr>
-      <w:rFonts w:asciiTheme="majorHAnsi" w:eastAsiaTheme="majorEastAsia" w:hAnsiTheme="majorHAnsi" w:cstheme="majorBidi" w:ascii="Malgun Gothic" w:hAnsi="Malgun Gothic" w:eastAsia="Malgun Gothic"/>
+      <w:rFonts w:asciiTheme="majorHAnsi" w:eastAsiaTheme="majorEastAsia" w:hAnsiTheme="majorHAnsi" w:cstheme="majorBidi"/>
       <w:b/>
       <w:bCs/>
       <w:i/>
       <w:iCs/>
       <w:color w:val="4F81BD" w:themeColor="accent1"/>
-      <w:sz w:val="18"/>
     </w:rPr>
   </w:style>
   <w:style w:type="paragraph" w:styleId="Heading5">
@@ -1466,9 +721,8 @@
       <w:outlineLvl w:val="4"/>
     </w:pPr>
     <w:rPr>
-      <w:rFonts w:asciiTheme="majorHAnsi" w:eastAsiaTheme="majorEastAsia" w:hAnsiTheme="majorHAnsi" w:cstheme="majorBidi" w:ascii="Malgun Gothic" w:hAnsi="Malgun Gothic" w:eastAsia="Malgun Gothic"/>
+      <w:rFonts w:asciiTheme="majorHAnsi" w:eastAsiaTheme="majorEastAsia" w:hAnsiTheme="majorHAnsi" w:cstheme="majorBidi"/>
       <w:color w:val="243F60" w:themeColor="accent1" w:themeShade="7F"/>
-      <w:sz w:val="18"/>
     </w:rPr>
   </w:style>
   <w:style w:type="paragraph" w:styleId="Heading6">
@@ -1488,11 +742,10 @@
       <w:outlineLvl w:val="5"/>
     </w:pPr>
     <w:rPr>
-      <w:rFonts w:asciiTheme="majorHAnsi" w:eastAsiaTheme="majorEastAsia" w:hAnsiTheme="majorHAnsi" w:cstheme="majorBidi" w:ascii="Malgun Gothic" w:hAnsi="Malgun Gothic" w:eastAsia="Malgun Gothic"/>
+      <w:rFonts w:asciiTheme="majorHAnsi" w:eastAsiaTheme="majorEastAsia" w:hAnsiTheme="majorHAnsi" w:cstheme="majorBidi"/>
       <w:i/>
       <w:iCs/>
       <w:color w:val="243F60" w:themeColor="accent1" w:themeShade="7F"/>
-      <w:sz w:val="18"/>
     </w:rPr>
   </w:style>
   <w:style w:type="paragraph" w:styleId="Heading7">
@@ -1512,11 +765,10 @@
       <w:outlineLvl w:val="6"/>
     </w:pPr>
     <w:rPr>
-      <w:rFonts w:asciiTheme="majorHAnsi" w:eastAsiaTheme="majorEastAsia" w:hAnsiTheme="majorHAnsi" w:cstheme="majorBidi" w:ascii="Malgun Gothic" w:hAnsi="Malgun Gothic" w:eastAsia="Malgun Gothic"/>
+      <w:rFonts w:asciiTheme="majorHAnsi" w:eastAsiaTheme="majorEastAsia" w:hAnsiTheme="majorHAnsi" w:cstheme="majorBidi"/>
       <w:i/>
       <w:iCs/>
       <w:color w:val="404040" w:themeColor="text1" w:themeTint="BF"/>
-      <w:sz w:val="18"/>
     </w:rPr>
   </w:style>
   <w:style w:type="paragraph" w:styleId="Heading8">
@@ -1536,9 +788,9 @@
       <w:outlineLvl w:val="7"/>
     </w:pPr>
     <w:rPr>
-      <w:rFonts w:asciiTheme="majorHAnsi" w:eastAsiaTheme="majorEastAsia" w:hAnsiTheme="majorHAnsi" w:cstheme="majorBidi" w:ascii="Malgun Gothic" w:hAnsi="Malgun Gothic" w:eastAsia="Malgun Gothic"/>
+      <w:rFonts w:asciiTheme="majorHAnsi" w:eastAsiaTheme="majorEastAsia" w:hAnsiTheme="majorHAnsi" w:cstheme="majorBidi"/>
       <w:color w:val="4F81BD" w:themeColor="accent1"/>
-      <w:sz w:val="18"/>
+      <w:sz w:val="20"/>
       <w:szCs w:val="20"/>
     </w:rPr>
   </w:style>
@@ -1559,11 +811,11 @@
       <w:outlineLvl w:val="8"/>
     </w:pPr>
     <w:rPr>
-      <w:rFonts w:asciiTheme="majorHAnsi" w:eastAsiaTheme="majorEastAsia" w:hAnsiTheme="majorHAnsi" w:cstheme="majorBidi" w:ascii="Malgun Gothic" w:hAnsi="Malgun Gothic" w:eastAsia="Malgun Gothic"/>
+      <w:rFonts w:asciiTheme="majorHAnsi" w:eastAsiaTheme="majorEastAsia" w:hAnsiTheme="majorHAnsi" w:cstheme="majorBidi"/>
       <w:i/>
       <w:iCs/>
       <w:color w:val="404040" w:themeColor="text1" w:themeTint="BF"/>
-      <w:sz w:val="18"/>
+      <w:sz w:val="20"/>
       <w:szCs w:val="20"/>
     </w:rPr>
   </w:style>
@@ -1572,10 +824,6 @@
     <w:uiPriority w:val="1"/>
     <w:semiHidden/>
     <w:unhideWhenUsed/>
-    <w:rPr>
-      <w:rFonts w:ascii="Malgun Gothic" w:hAnsi="Malgun Gothic" w:eastAsia="Malgun Gothic"/>
-      <w:sz w:val="18"/>
-    </w:rPr>
   </w:style>
   <w:style w:type="table" w:default="1" w:styleId="TableNormal">
     <w:name w:val="Normal Table"/>
@@ -1606,10 +854,6 @@
     <w:pPr>
       <w:spacing w:after="0" w:line="240" w:lineRule="auto"/>
     </w:pPr>
-    <w:rPr>
-      <w:rFonts w:ascii="Malgun Gothic" w:hAnsi="Malgun Gothic" w:eastAsia="Malgun Gothic"/>
-      <w:sz w:val="18"/>
-    </w:rPr>
   </w:style>
   <w:style w:type="character" w:customStyle="1" w:styleId="Heading1Char">
     <w:name w:val="Heading 1 Char"/>
@@ -1618,11 +862,11 @@
     <w:uiPriority w:val="9"/>
     <w:rsid w:val="00FC693F"/>
     <w:rPr>
-      <w:rFonts w:asciiTheme="majorHAnsi" w:eastAsiaTheme="majorEastAsia" w:hAnsiTheme="majorHAnsi" w:cstheme="majorBidi" w:ascii="Malgun Gothic" w:hAnsi="Malgun Gothic" w:eastAsia="Malgun Gothic"/>
+      <w:rFonts w:asciiTheme="majorHAnsi" w:eastAsiaTheme="majorEastAsia" w:hAnsiTheme="majorHAnsi" w:cstheme="majorBidi"/>
       <w:b/>
       <w:bCs/>
       <w:color w:val="365F91" w:themeColor="accent1" w:themeShade="BF"/>
-      <w:sz w:val="18"/>
+      <w:sz w:val="28"/>
       <w:szCs w:val="28"/>
     </w:rPr>
   </w:style>
@@ -1633,11 +877,11 @@
     <w:uiPriority w:val="9"/>
     <w:rsid w:val="00FC693F"/>
     <w:rPr>
-      <w:rFonts w:asciiTheme="majorHAnsi" w:eastAsiaTheme="majorEastAsia" w:hAnsiTheme="majorHAnsi" w:cstheme="majorBidi" w:ascii="Malgun Gothic" w:hAnsi="Malgun Gothic" w:eastAsia="Malgun Gothic"/>
+      <w:rFonts w:asciiTheme="majorHAnsi" w:eastAsiaTheme="majorEastAsia" w:hAnsiTheme="majorHAnsi" w:cstheme="majorBidi"/>
       <w:b/>
       <w:bCs/>
       <w:color w:val="4F81BD" w:themeColor="accent1"/>
-      <w:sz w:val="18"/>
+      <w:sz w:val="26"/>
       <w:szCs w:val="26"/>
     </w:rPr>
   </w:style>
@@ -1648,11 +892,10 @@
     <w:uiPriority w:val="9"/>
     <w:rsid w:val="00FC693F"/>
     <w:rPr>
-      <w:rFonts w:asciiTheme="majorHAnsi" w:eastAsiaTheme="majorEastAsia" w:hAnsiTheme="majorHAnsi" w:cstheme="majorBidi" w:ascii="Malgun Gothic" w:hAnsi="Malgun Gothic" w:eastAsia="Malgun Gothic"/>
+      <w:rFonts w:asciiTheme="majorHAnsi" w:eastAsiaTheme="majorEastAsia" w:hAnsiTheme="majorHAnsi" w:cstheme="majorBidi"/>
       <w:b/>
       <w:bCs/>
       <w:color w:val="4F81BD" w:themeColor="accent1"/>
-      <w:sz w:val="18"/>
     </w:rPr>
   </w:style>
   <w:style w:type="paragraph" w:styleId="Title">
@@ -1672,10 +915,10 @@
     </w:pPr>
     <w:rPr>
       <w:rFonts w:asciiTheme="majorHAnsi" w:eastAsiaTheme="majorEastAsia" w:hAnsiTheme="majorHAnsi" w:cstheme="majorBidi" w:ascii="Malgun Gothic" w:hAnsi="Malgun Gothic" w:eastAsia="Malgun Gothic"/>
-      <w:color w:val="17365D" w:themeColor="text2" w:themeShade="BF"/>
+      <w:color w:val="173647"/>
       <w:spacing w:val="5"/>
       <w:kern w:val="28"/>
-      <w:sz w:val="18"/>
+      <w:sz w:val="32"/>
       <w:szCs w:val="52"/>
     </w:rPr>
   </w:style>
@@ -1686,11 +929,11 @@
     <w:uiPriority w:val="10"/>
     <w:rsid w:val="00FC693F"/>
     <w:rPr>
-      <w:rFonts w:asciiTheme="majorHAnsi" w:eastAsiaTheme="majorEastAsia" w:hAnsiTheme="majorHAnsi" w:cstheme="majorBidi" w:ascii="Malgun Gothic" w:hAnsi="Malgun Gothic" w:eastAsia="Malgun Gothic"/>
+      <w:rFonts w:asciiTheme="majorHAnsi" w:eastAsiaTheme="majorEastAsia" w:hAnsiTheme="majorHAnsi" w:cstheme="majorBidi"/>
       <w:color w:val="17365D" w:themeColor="text2" w:themeShade="BF"/>
       <w:spacing w:val="5"/>
       <w:kern w:val="28"/>
-      <w:sz w:val="18"/>
+      <w:sz w:val="52"/>
       <w:szCs w:val="52"/>
     </w:rPr>
   </w:style>
@@ -1708,12 +951,12 @@
       </w:numPr>
     </w:pPr>
     <w:rPr>
-      <w:rFonts w:asciiTheme="majorHAnsi" w:eastAsiaTheme="majorEastAsia" w:hAnsiTheme="majorHAnsi" w:cstheme="majorBidi" w:ascii="Malgun Gothic" w:hAnsi="Malgun Gothic" w:eastAsia="Malgun Gothic"/>
+      <w:rFonts w:asciiTheme="majorHAnsi" w:eastAsiaTheme="majorEastAsia" w:hAnsiTheme="majorHAnsi" w:cstheme="majorBidi"/>
       <w:i/>
       <w:iCs/>
       <w:color w:val="4F81BD" w:themeColor="accent1"/>
       <w:spacing w:val="15"/>
-      <w:sz w:val="18"/>
+      <w:sz w:val="24"/>
       <w:szCs w:val="24"/>
     </w:rPr>
   </w:style>
@@ -1724,12 +967,12 @@
     <w:uiPriority w:val="11"/>
     <w:rsid w:val="00FC693F"/>
     <w:rPr>
-      <w:rFonts w:asciiTheme="majorHAnsi" w:eastAsiaTheme="majorEastAsia" w:hAnsiTheme="majorHAnsi" w:cstheme="majorBidi" w:ascii="Malgun Gothic" w:hAnsi="Malgun Gothic" w:eastAsia="Malgun Gothic"/>
+      <w:rFonts w:asciiTheme="majorHAnsi" w:eastAsiaTheme="majorEastAsia" w:hAnsiTheme="majorHAnsi" w:cstheme="majorBidi"/>
       <w:i/>
       <w:iCs/>
       <w:color w:val="4F81BD" w:themeColor="accent1"/>
       <w:spacing w:val="15"/>
-      <w:sz w:val="18"/>
+      <w:sz w:val="24"/>
       <w:szCs w:val="24"/>
     </w:rPr>
   </w:style>
@@ -1743,10 +986,6 @@
       <w:ind w:left="720"/>
       <w:contextualSpacing/>
     </w:pPr>
-    <w:rPr>
-      <w:rFonts w:ascii="Malgun Gothic" w:hAnsi="Malgun Gothic" w:eastAsia="Malgun Gothic"/>
-      <w:sz w:val="18"/>
-    </w:rPr>
   </w:style>
   <w:style w:type="paragraph" w:styleId="BodyText">
     <w:name w:val="Body Text"/>
@@ -1758,10 +997,6 @@
     <w:pPr>
       <w:spacing w:after="120"/>
     </w:pPr>
-    <w:rPr>
-      <w:rFonts w:ascii="Malgun Gothic" w:hAnsi="Malgun Gothic" w:eastAsia="Malgun Gothic"/>
-      <w:sz w:val="18"/>
-    </w:rPr>
   </w:style>
   <w:style w:type="character" w:customStyle="1" w:styleId="BodyTextChar">
     <w:name w:val="Body Text Char"/>
@@ -1769,10 +1004,6 @@
     <w:link w:val="BodyText"/>
     <w:uiPriority w:val="99"/>
     <w:rsid w:val="00AA1D8D"/>
-    <w:rPr>
-      <w:rFonts w:ascii="Malgun Gothic" w:hAnsi="Malgun Gothic" w:eastAsia="Malgun Gothic"/>
-      <w:sz w:val="18"/>
-    </w:rPr>
   </w:style>
   <w:style w:type="paragraph" w:styleId="BodyText2">
     <w:name w:val="Body Text 2"/>
@@ -1784,10 +1015,6 @@
     <w:pPr>
       <w:spacing w:after="120" w:line="480" w:lineRule="auto"/>
     </w:pPr>
-    <w:rPr>
-      <w:rFonts w:ascii="Malgun Gothic" w:hAnsi="Malgun Gothic" w:eastAsia="Malgun Gothic"/>
-      <w:sz w:val="18"/>
-    </w:rPr>
   </w:style>
   <w:style w:type="character" w:customStyle="1" w:styleId="BodyText2Char">
     <w:name w:val="Body Text 2 Char"/>
@@ -1795,10 +1022,6 @@
     <w:link w:val="BodyText2"/>
     <w:uiPriority w:val="99"/>
     <w:rsid w:val="00AA1D8D"/>
-    <w:rPr>
-      <w:rFonts w:ascii="Malgun Gothic" w:hAnsi="Malgun Gothic" w:eastAsia="Malgun Gothic"/>
-      <w:sz w:val="18"/>
-    </w:rPr>
   </w:style>
   <w:style w:type="paragraph" w:styleId="BodyText3">
     <w:name w:val="Body Text 3"/>
@@ -1811,8 +1034,7 @@
       <w:spacing w:after="120"/>
     </w:pPr>
     <w:rPr>
-      <w:rFonts w:ascii="Malgun Gothic" w:hAnsi="Malgun Gothic" w:eastAsia="Malgun Gothic"/>
-      <w:sz w:val="18"/>
+      <w:sz w:val="16"/>
       <w:szCs w:val="16"/>
     </w:rPr>
   </w:style>
@@ -1823,8 +1045,7 @@
     <w:uiPriority w:val="99"/>
     <w:rsid w:val="00AA1D8D"/>
     <w:rPr>
-      <w:rFonts w:ascii="Malgun Gothic" w:hAnsi="Malgun Gothic" w:eastAsia="Malgun Gothic"/>
-      <w:sz w:val="18"/>
+      <w:sz w:val="16"/>
       <w:szCs w:val="16"/>
     </w:rPr>
   </w:style>
@@ -1838,10 +1059,6 @@
       <w:ind w:left="360" w:hanging="360"/>
       <w:contextualSpacing/>
     </w:pPr>
-    <w:rPr>
-      <w:rFonts w:ascii="Malgun Gothic" w:hAnsi="Malgun Gothic" w:eastAsia="Malgun Gothic"/>
-      <w:sz w:val="18"/>
-    </w:rPr>
   </w:style>
   <w:style w:type="paragraph" w:styleId="List2">
     <w:name w:val="List 2"/>
@@ -1853,10 +1070,6 @@
       <w:ind w:left="720" w:hanging="360"/>
       <w:contextualSpacing/>
     </w:pPr>
-    <w:rPr>
-      <w:rFonts w:ascii="Malgun Gothic" w:hAnsi="Malgun Gothic" w:eastAsia="Malgun Gothic"/>
-      <w:sz w:val="18"/>
-    </w:rPr>
   </w:style>
   <w:style w:type="paragraph" w:styleId="List3">
     <w:name w:val="List 3"/>
@@ -1868,10 +1081,6 @@
       <w:ind w:left="1080" w:hanging="360"/>
       <w:contextualSpacing/>
     </w:pPr>
-    <w:rPr>
-      <w:rFonts w:ascii="Malgun Gothic" w:hAnsi="Malgun Gothic" w:eastAsia="Malgun Gothic"/>
-      <w:sz w:val="18"/>
-    </w:rPr>
   </w:style>
   <w:style w:type="paragraph" w:styleId="ListBullet">
     <w:name w:val="List Bullet"/>
@@ -1885,10 +1094,6 @@
       </w:numPr>
       <w:contextualSpacing/>
     </w:pPr>
-    <w:rPr>
-      <w:rFonts w:ascii="Malgun Gothic" w:hAnsi="Malgun Gothic" w:eastAsia="Malgun Gothic"/>
-      <w:sz w:val="18"/>
-    </w:rPr>
   </w:style>
   <w:style w:type="paragraph" w:styleId="ListBullet2">
     <w:name w:val="List Bullet 2"/>
@@ -1902,10 +1107,6 @@
       </w:numPr>
       <w:contextualSpacing/>
     </w:pPr>
-    <w:rPr>
-      <w:rFonts w:ascii="Malgun Gothic" w:hAnsi="Malgun Gothic" w:eastAsia="Malgun Gothic"/>
-      <w:sz w:val="18"/>
-    </w:rPr>
   </w:style>
   <w:style w:type="paragraph" w:styleId="ListBullet3">
     <w:name w:val="List Bullet 3"/>
@@ -1919,10 +1120,6 @@
       </w:numPr>
       <w:contextualSpacing/>
     </w:pPr>
-    <w:rPr>
-      <w:rFonts w:ascii="Malgun Gothic" w:hAnsi="Malgun Gothic" w:eastAsia="Malgun Gothic"/>
-      <w:sz w:val="18"/>
-    </w:rPr>
   </w:style>
   <w:style w:type="paragraph" w:styleId="ListNumber">
     <w:name w:val="List Number"/>
@@ -1936,10 +1133,6 @@
       </w:numPr>
       <w:contextualSpacing/>
     </w:pPr>
-    <w:rPr>
-      <w:rFonts w:ascii="Malgun Gothic" w:hAnsi="Malgun Gothic" w:eastAsia="Malgun Gothic"/>
-      <w:sz w:val="18"/>
-    </w:rPr>
   </w:style>
   <w:style w:type="paragraph" w:styleId="ListNumber2">
     <w:name w:val="List Number 2"/>
@@ -1953,10 +1146,6 @@
       </w:numPr>
       <w:contextualSpacing/>
     </w:pPr>
-    <w:rPr>
-      <w:rFonts w:ascii="Malgun Gothic" w:hAnsi="Malgun Gothic" w:eastAsia="Malgun Gothic"/>
-      <w:sz w:val="18"/>
-    </w:rPr>
   </w:style>
   <w:style w:type="paragraph" w:styleId="ListNumber3">
     <w:name w:val="List Number 3"/>
@@ -1970,10 +1159,6 @@
       </w:numPr>
       <w:contextualSpacing/>
     </w:pPr>
-    <w:rPr>
-      <w:rFonts w:ascii="Malgun Gothic" w:hAnsi="Malgun Gothic" w:eastAsia="Malgun Gothic"/>
-      <w:sz w:val="18"/>
-    </w:rPr>
   </w:style>
   <w:style w:type="paragraph" w:styleId="ListContinue">
     <w:name w:val="List Continue"/>
@@ -1986,10 +1171,6 @@
       <w:ind w:left="360"/>
       <w:contextualSpacing/>
     </w:pPr>
-    <w:rPr>
-      <w:rFonts w:ascii="Malgun Gothic" w:hAnsi="Malgun Gothic" w:eastAsia="Malgun Gothic"/>
-      <w:sz w:val="18"/>
-    </w:rPr>
   </w:style>
   <w:style w:type="paragraph" w:styleId="ListContinue2">
     <w:name w:val="List Continue 2"/>
@@ -2002,10 +1183,6 @@
       <w:ind w:left="720"/>
       <w:contextualSpacing/>
     </w:pPr>
-    <w:rPr>
-      <w:rFonts w:ascii="Malgun Gothic" w:hAnsi="Malgun Gothic" w:eastAsia="Malgun Gothic"/>
-      <w:sz w:val="18"/>
-    </w:rPr>
   </w:style>
   <w:style w:type="paragraph" w:styleId="ListContinue3">
     <w:name w:val="List Continue 3"/>
@@ -2018,10 +1195,6 @@
       <w:ind w:left="1080"/>
       <w:contextualSpacing/>
     </w:pPr>
-    <w:rPr>
-      <w:rFonts w:ascii="Malgun Gothic" w:hAnsi="Malgun Gothic" w:eastAsia="Malgun Gothic"/>
-      <w:sz w:val="18"/>
-    </w:rPr>
   </w:style>
   <w:style w:type="paragraph" w:styleId="MacroText">
     <w:name w:val="macro"/>
@@ -2041,8 +1214,8 @@
       </w:tabs>
     </w:pPr>
     <w:rPr>
-      <w:rFonts w:ascii="Malgun Gothic" w:hAnsi="Malgun Gothic" w:eastAsia="Malgun Gothic"/>
-      <w:sz w:val="18"/>
+      <w:rFonts w:ascii="Courier" w:hAnsi="Courier"/>
+      <w:sz w:val="20"/>
       <w:szCs w:val="20"/>
     </w:rPr>
   </w:style>
@@ -2053,8 +1226,8 @@
     <w:uiPriority w:val="99"/>
     <w:rsid w:val="0029639D"/>
     <w:rPr>
-      <w:rFonts w:ascii="Malgun Gothic" w:hAnsi="Malgun Gothic" w:eastAsia="Malgun Gothic"/>
-      <w:sz w:val="18"/>
+      <w:rFonts w:ascii="Courier" w:hAnsi="Courier"/>
+      <w:sz w:val="20"/>
       <w:szCs w:val="20"/>
     </w:rPr>
   </w:style>
@@ -2067,11 +1240,9 @@
     <w:qFormat/>
     <w:rsid w:val="00FC693F"/>
     <w:rPr>
-      <w:rFonts w:ascii="Malgun Gothic" w:hAnsi="Malgun Gothic" w:eastAsia="Malgun Gothic"/>
       <w:i/>
       <w:iCs/>
       <w:color w:val="000000" w:themeColor="text1"/>
-      <w:sz w:val="18"/>
     </w:rPr>
   </w:style>
   <w:style w:type="character" w:customStyle="1" w:styleId="QuoteChar">
@@ -2081,11 +1252,9 @@
     <w:uiPriority w:val="29"/>
     <w:rsid w:val="00FC693F"/>
     <w:rPr>
-      <w:rFonts w:ascii="Malgun Gothic" w:hAnsi="Malgun Gothic" w:eastAsia="Malgun Gothic"/>
       <w:i/>
       <w:iCs/>
       <w:color w:val="000000" w:themeColor="text1"/>
-      <w:sz w:val="18"/>
     </w:rPr>
   </w:style>
   <w:style w:type="character" w:customStyle="1" w:styleId="Heading4Char">
@@ -2096,13 +1265,12 @@
     <w:semiHidden/>
     <w:rsid w:val="00FC693F"/>
     <w:rPr>
-      <w:rFonts w:asciiTheme="majorHAnsi" w:eastAsiaTheme="majorEastAsia" w:hAnsiTheme="majorHAnsi" w:cstheme="majorBidi" w:ascii="Malgun Gothic" w:hAnsi="Malgun Gothic" w:eastAsia="Malgun Gothic"/>
+      <w:rFonts w:asciiTheme="majorHAnsi" w:eastAsiaTheme="majorEastAsia" w:hAnsiTheme="majorHAnsi" w:cstheme="majorBidi"/>
       <w:b/>
       <w:bCs/>
       <w:i/>
       <w:iCs/>
       <w:color w:val="4F81BD" w:themeColor="accent1"/>
-      <w:sz w:val="18"/>
     </w:rPr>
   </w:style>
   <w:style w:type="character" w:customStyle="1" w:styleId="Heading5Char">
@@ -2113,9 +1281,8 @@
     <w:semiHidden/>
     <w:rsid w:val="00FC693F"/>
     <w:rPr>
-      <w:rFonts w:asciiTheme="majorHAnsi" w:eastAsiaTheme="majorEastAsia" w:hAnsiTheme="majorHAnsi" w:cstheme="majorBidi" w:ascii="Malgun Gothic" w:hAnsi="Malgun Gothic" w:eastAsia="Malgun Gothic"/>
+      <w:rFonts w:asciiTheme="majorHAnsi" w:eastAsiaTheme="majorEastAsia" w:hAnsiTheme="majorHAnsi" w:cstheme="majorBidi"/>
       <w:color w:val="243F60" w:themeColor="accent1" w:themeShade="7F"/>
-      <w:sz w:val="18"/>
     </w:rPr>
   </w:style>
   <w:style w:type="character" w:customStyle="1" w:styleId="Heading6Char">
@@ -2126,11 +1293,10 @@
     <w:semiHidden/>
     <w:rsid w:val="00FC693F"/>
     <w:rPr>
-      <w:rFonts w:asciiTheme="majorHAnsi" w:eastAsiaTheme="majorEastAsia" w:hAnsiTheme="majorHAnsi" w:cstheme="majorBidi" w:ascii="Malgun Gothic" w:hAnsi="Malgun Gothic" w:eastAsia="Malgun Gothic"/>
+      <w:rFonts w:asciiTheme="majorHAnsi" w:eastAsiaTheme="majorEastAsia" w:hAnsiTheme="majorHAnsi" w:cstheme="majorBidi"/>
       <w:i/>
       <w:iCs/>
       <w:color w:val="243F60" w:themeColor="accent1" w:themeShade="7F"/>
-      <w:sz w:val="18"/>
     </w:rPr>
   </w:style>
   <w:style w:type="character" w:customStyle="1" w:styleId="Heading7Char">
@@ -2141,11 +1307,10 @@
     <w:semiHidden/>
     <w:rsid w:val="00FC693F"/>
     <w:rPr>
-      <w:rFonts w:asciiTheme="majorHAnsi" w:eastAsiaTheme="majorEastAsia" w:hAnsiTheme="majorHAnsi" w:cstheme="majorBidi" w:ascii="Malgun Gothic" w:hAnsi="Malgun Gothic" w:eastAsia="Malgun Gothic"/>
+      <w:rFonts w:asciiTheme="majorHAnsi" w:eastAsiaTheme="majorEastAsia" w:hAnsiTheme="majorHAnsi" w:cstheme="majorBidi"/>
       <w:i/>
       <w:iCs/>
       <w:color w:val="404040" w:themeColor="text1" w:themeTint="BF"/>
-      <w:sz w:val="18"/>
     </w:rPr>
   </w:style>
   <w:style w:type="character" w:customStyle="1" w:styleId="Heading8Char">
@@ -2156,9 +1321,9 @@
     <w:semiHidden/>
     <w:rsid w:val="00FC693F"/>
     <w:rPr>
-      <w:rFonts w:asciiTheme="majorHAnsi" w:eastAsiaTheme="majorEastAsia" w:hAnsiTheme="majorHAnsi" w:cstheme="majorBidi" w:ascii="Malgun Gothic" w:hAnsi="Malgun Gothic" w:eastAsia="Malgun Gothic"/>
+      <w:rFonts w:asciiTheme="majorHAnsi" w:eastAsiaTheme="majorEastAsia" w:hAnsiTheme="majorHAnsi" w:cstheme="majorBidi"/>
       <w:color w:val="4F81BD" w:themeColor="accent1"/>
-      <w:sz w:val="18"/>
+      <w:sz w:val="20"/>
       <w:szCs w:val="20"/>
     </w:rPr>
   </w:style>
@@ -2170,11 +1335,11 @@
     <w:semiHidden/>
     <w:rsid w:val="00FC693F"/>
     <w:rPr>
-      <w:rFonts w:asciiTheme="majorHAnsi" w:eastAsiaTheme="majorEastAsia" w:hAnsiTheme="majorHAnsi" w:cstheme="majorBidi" w:ascii="Malgun Gothic" w:hAnsi="Malgun Gothic" w:eastAsia="Malgun Gothic"/>
+      <w:rFonts w:asciiTheme="majorHAnsi" w:eastAsiaTheme="majorEastAsia" w:hAnsiTheme="majorHAnsi" w:cstheme="majorBidi"/>
       <w:i/>
       <w:iCs/>
       <w:color w:val="404040" w:themeColor="text1" w:themeTint="BF"/>
-      <w:sz w:val="18"/>
+      <w:sz w:val="20"/>
       <w:szCs w:val="20"/>
     </w:rPr>
   </w:style>
@@ -2191,7 +1356,6 @@
       <w:spacing w:line="240" w:lineRule="auto"/>
     </w:pPr>
     <w:rPr>
-      <w:rFonts w:ascii="Malgun Gothic" w:hAnsi="Malgun Gothic" w:eastAsia="Malgun Gothic"/>
       <w:b/>
       <w:bCs/>
       <w:color w:val="4F81BD" w:themeColor="accent1"/>
@@ -2206,10 +1370,8 @@
     <w:qFormat/>
     <w:rsid w:val="00FC693F"/>
     <w:rPr>
-      <w:rFonts w:ascii="Malgun Gothic" w:hAnsi="Malgun Gothic" w:eastAsia="Malgun Gothic"/>
       <w:b/>
       <w:bCs/>
-      <w:sz w:val="18"/>
     </w:rPr>
   </w:style>
   <w:style w:type="character" w:styleId="Emphasis">
@@ -2219,10 +1381,8 @@
     <w:qFormat/>
     <w:rsid w:val="00FC693F"/>
     <w:rPr>
-      <w:rFonts w:ascii="Malgun Gothic" w:hAnsi="Malgun Gothic" w:eastAsia="Malgun Gothic"/>
       <w:i/>
       <w:iCs/>
-      <w:sz w:val="18"/>
     </w:rPr>
   </w:style>
   <w:style w:type="paragraph" w:styleId="IntenseQuote">
@@ -2241,13 +1401,11 @@
       <w:ind w:left="936" w:right="936"/>
     </w:pPr>
     <w:rPr>
-      <w:rFonts w:ascii="Malgun Gothic" w:hAnsi="Malgun Gothic" w:eastAsia="Malgun Gothic"/>
       <w:b/>
       <w:bCs/>
       <w:i/>
       <w:iCs/>
       <w:color w:val="4F81BD" w:themeColor="accent1"/>
-      <w:sz w:val="18"/>
     </w:rPr>
   </w:style>
   <w:style w:type="character" w:customStyle="1" w:styleId="IntenseQuoteChar">
@@ -2257,13 +1415,11 @@
     <w:uiPriority w:val="30"/>
     <w:rsid w:val="00FC693F"/>
     <w:rPr>
-      <w:rFonts w:ascii="Malgun Gothic" w:hAnsi="Malgun Gothic" w:eastAsia="Malgun Gothic"/>
       <w:b/>
       <w:bCs/>
       <w:i/>
       <w:iCs/>
       <w:color w:val="4F81BD" w:themeColor="accent1"/>
-      <w:sz w:val="18"/>
     </w:rPr>
   </w:style>
   <w:style w:type="character" w:styleId="SubtleEmphasis">
@@ -2273,11 +1429,9 @@
     <w:qFormat/>
     <w:rsid w:val="00FC693F"/>
     <w:rPr>
-      <w:rFonts w:ascii="Malgun Gothic" w:hAnsi="Malgun Gothic" w:eastAsia="Malgun Gothic"/>
       <w:i/>
       <w:iCs/>
       <w:color w:val="808080" w:themeColor="text1" w:themeTint="7F"/>
-      <w:sz w:val="18"/>
     </w:rPr>
   </w:style>
   <w:style w:type="character" w:styleId="IntenseEmphasis">
@@ -2287,13 +1441,11 @@
     <w:qFormat/>
     <w:rsid w:val="00FC693F"/>
     <w:rPr>
-      <w:rFonts w:ascii="Malgun Gothic" w:hAnsi="Malgun Gothic" w:eastAsia="Malgun Gothic"/>
       <w:b/>
       <w:bCs/>
       <w:i/>
       <w:iCs/>
       <w:color w:val="4F81BD" w:themeColor="accent1"/>
-      <w:sz w:val="18"/>
     </w:rPr>
   </w:style>
   <w:style w:type="character" w:styleId="SubtleReference">
@@ -2303,10 +1455,8 @@
     <w:qFormat/>
     <w:rsid w:val="00FC693F"/>
     <w:rPr>
-      <w:rFonts w:ascii="Malgun Gothic" w:hAnsi="Malgun Gothic" w:eastAsia="Malgun Gothic"/>
       <w:smallCaps/>
       <w:color w:val="C0504D" w:themeColor="accent2"/>
-      <w:sz w:val="18"/>
       <w:u w:val="single"/>
     </w:rPr>
   </w:style>
@@ -2317,13 +1467,11 @@
     <w:qFormat/>
     <w:rsid w:val="00FC693F"/>
     <w:rPr>
-      <w:rFonts w:ascii="Malgun Gothic" w:hAnsi="Malgun Gothic" w:eastAsia="Malgun Gothic"/>
       <w:b/>
       <w:bCs/>
       <w:smallCaps/>
       <w:color w:val="C0504D" w:themeColor="accent2"/>
       <w:spacing w:val="5"/>
-      <w:sz w:val="18"/>
       <w:u w:val="single"/>
     </w:rPr>
   </w:style>
@@ -2334,12 +1482,10 @@
     <w:qFormat/>
     <w:rsid w:val="00FC693F"/>
     <w:rPr>
-      <w:rFonts w:ascii="Malgun Gothic" w:hAnsi="Malgun Gothic" w:eastAsia="Malgun Gothic"/>
       <w:b/>
       <w:bCs/>
       <w:smallCaps/>
       <w:spacing w:val="5"/>
-      <w:sz w:val="18"/>
     </w:rPr>
   </w:style>
   <w:style w:type="paragraph" w:styleId="TOCHeading">
@@ -2354,10 +1500,6 @@
     <w:pPr>
       <w:outlineLvl w:val="9"/>
     </w:pPr>
-    <w:rPr>
-      <w:rFonts w:ascii="Malgun Gothic" w:hAnsi="Malgun Gothic" w:eastAsia="Malgun Gothic"/>
-      <w:sz w:val="18"/>
-    </w:rPr>
   </w:style>
   <w:style w:type="table" w:styleId="TableGrid">
     <w:name w:val="Table Grid"/>

</xml_diff>

<commit_message>
docs: publish confirmed instructor background across lecture kit
</commit_message>
<xml_diff>
--- a/public/dontstop-lecture/profile-friendly.docx
+++ b/public/dontstop-lecture/profile-friendly.docx
@@ -57,6 +57,11 @@
       </w:tr>
     </w:tbl>
     <w:p>
+      <w:r>
+        <w:t>호주 시드니대학교 졸업 · 해외 생활 경험</w:t>
+      </w:r>
+    </w:p>
+    <w:p>
       <w:pPr>
         <w:pStyle w:val="Heading1"/>
       </w:pPr>
@@ -94,14 +99,6 @@
         <w:t>강사 이력 사항</w:t>
       </w:r>
     </w:p>
-    <w:p>
-      <w:pPr>
-        <w:pStyle w:val="Heading2"/>
-      </w:pPr>
-      <w:r>
-        <w:t>주요 이력</w:t>
-      </w:r>
-    </w:p>
     <w:tbl>
       <w:tblPr>
         <w:tblStyle w:val="TableGrid"/>
@@ -109,38 +106,27 @@
         <w:tblLook w:firstColumn="1" w:firstRow="1" w:lastColumn="0" w:lastRow="0" w:noHBand="0" w:noVBand="1" w:val="04A0"/>
       </w:tblPr>
       <w:tblGrid>
-        <w:gridCol w:w="3326"/>
-        <w:gridCol w:w="3326"/>
-        <w:gridCol w:w="3326"/>
+        <w:gridCol w:w="4989"/>
+        <w:gridCol w:w="4989"/>
       </w:tblGrid>
       <w:tr>
         <w:tc>
           <w:tcPr>
-            <w:tcW w:type="dxa" w:w="3326"/>
+            <w:tcW w:type="dxa" w:w="4989"/>
           </w:tcPr>
           <w:p>
             <w:r>
-              <w:t>학력 / 전공</w:t>
+              <w:t>학력</w:t>
             </w:r>
           </w:p>
         </w:tc>
         <w:tc>
           <w:tcPr>
-            <w:tcW w:type="dxa" w:w="3326"/>
+            <w:tcW w:type="dxa" w:w="4989"/>
           </w:tcPr>
           <w:p>
             <w:r>
-              <w:t>주요 경력</w:t>
-            </w:r>
-          </w:p>
-        </w:tc>
-        <w:tc>
-          <w:tcPr>
-            <w:tcW w:type="dxa" w:w="3326"/>
-          </w:tcPr>
-          <w:p>
-            <w:r>
-              <w:t>자격 / 출강 이력</w:t>
+              <w:t>호주 시드니대학교 졸업</w:t>
             </w:r>
           </w:p>
         </w:tc>
@@ -148,21 +134,23 @@
       <w:tr>
         <w:tc>
           <w:tcPr>
-            <w:tcW w:type="dxa" w:w="3326"/>
+            <w:tcW w:type="dxa" w:w="4989"/>
           </w:tcPr>
-          <w:p/>
+          <w:p>
+            <w:r>
+              <w:t>경험</w:t>
+            </w:r>
+          </w:p>
         </w:tc>
         <w:tc>
           <w:tcPr>
-            <w:tcW w:type="dxa" w:w="3326"/>
+            <w:tcW w:type="dxa" w:w="4989"/>
           </w:tcPr>
-          <w:p/>
-        </w:tc>
-        <w:tc>
-          <w:tcPr>
-            <w:tcW w:type="dxa" w:w="3326"/>
-          </w:tcPr>
-          <w:p/>
+          <w:p>
+            <w:r>
+              <w:t>해외 생활 경험</w:t>
+            </w:r>
+          </w:p>
         </w:tc>
       </w:tr>
     </w:tbl>
@@ -191,7 +179,7 @@
       <w:pStyle w:val="Footer"/>
     </w:pPr>
     <w:r>
-      <w:t>본인의 실제 이력과 증빙을 확인해 작성합니다. 기관 지정 서식을 우선 사용합니다.</w:t>
+      <w:t>추가 이력은 기관 요청에 맞춰 준비합니다. 기관 지정 서식을 우선 사용합니다.</w:t>
     </w:r>
   </w:p>
 </w:ftr>

</xml_diff>